<commit_message>
modifaied trauma final exem
</commit_message>
<xml_diff>
--- a/mda/files/trauma/summeriz_rauma_events.docx
+++ b/mda/files/trauma/summeriz_rauma_events.docx
@@ -10,7 +10,6 @@
       </w:r>
     </w:p>
     <w:p>
-      <w:proofErr w:type="spellStart"/>
       <w:r>
         <w:rPr>
           <w:i/>
@@ -18,49 +17,8 @@
           <w:sz w:val="22"/>
           <w:szCs w:val="22"/>
         </w:rPr>
-        <w:t>Traumatic</w:t>
-      </w:r>
-      <w:proofErr w:type="spellEnd"/>
-      <w:r>
-        <w:rPr>
-          <w:i/>
-          <w:iCs/>
-          <w:sz w:val="22"/>
-          <w:szCs w:val="22"/>
-        </w:rPr>
-        <w:t xml:space="preserve"> </w:t>
-      </w:r>
-      <w:proofErr w:type="spellStart"/>
-      <w:r>
-        <w:rPr>
-          <w:i/>
-          <w:iCs/>
-          <w:sz w:val="22"/>
-          <w:szCs w:val="22"/>
-        </w:rPr>
-        <w:t>Cardiopulmonary</w:t>
-      </w:r>
-      <w:proofErr w:type="spellEnd"/>
-      <w:r>
-        <w:rPr>
-          <w:i/>
-          <w:iCs/>
-          <w:sz w:val="22"/>
-          <w:szCs w:val="22"/>
-        </w:rPr>
-        <w:t xml:space="preserve"> </w:t>
-      </w:r>
-      <w:proofErr w:type="spellStart"/>
-      <w:r>
-        <w:rPr>
-          <w:i/>
-          <w:iCs/>
-          <w:sz w:val="22"/>
-          <w:szCs w:val="22"/>
-        </w:rPr>
-        <w:t>Arrest</w:t>
-      </w:r>
-      <w:proofErr w:type="spellEnd"/>
+        <w:t>Traumatic Cardiopulmonary Arrest</w:t>
+      </w:r>
     </w:p>
     <w:p/>
     <w:p>
@@ -88,39 +46,59 @@
         <w:t>הנשמה באמצעות מפוח</w:t>
       </w:r>
     </w:p>
-    <w:p>
-      <w:pPr>
+    <w:p/>
+    <w:p>
+      <w:r>
         <w:rPr>
           <w:rFonts w:hint="cs"/>
         </w:rPr>
-      </w:pPr>
+        <w:t>2. תנאים לביצוע טיפול מציל חיים</w:t>
+      </w:r>
     </w:p>
     <w:p>
       <w:r>
         <w:rPr>
           <w:rFonts w:hint="cs"/>
         </w:rPr>
-        <w:t>2. תנאים לביצוע טיפול מציל חיים</w:t>
-      </w:r>
-    </w:p>
-    <w:p>
+        <w:t xml:space="preserve">לא </w:t>
+      </w:r>
+      <w:r>
+        <w:rPr>
+          <w:rtl w:val="0"/>
+        </w:rPr>
+        <w:t>Asystole</w:t>
+      </w:r>
       <w:r>
         <w:rPr>
           <w:rFonts w:hint="cs"/>
         </w:rPr>
-        <w:t xml:space="preserve">לא </w:t>
+        <w:t xml:space="preserve"> ולא </w:t>
       </w:r>
       <w:r>
         <w:rPr>
           <w:rtl w:val="0"/>
         </w:rPr>
+        <w:t>pea</w:t>
+      </w:r>
+      <w:r>
+        <w:rPr>
+          <w:rFonts w:hint="cs"/>
+        </w:rPr>
+        <w:t xml:space="preserve"> מתחת ל 40 פעימות בדקה</w:t>
+      </w:r>
+    </w:p>
+    <w:p>
+      <w:r>
+        <w:rPr>
+          <w:rtl w:val="0"/>
+        </w:rPr>
         <w:t>Asystole</w:t>
       </w:r>
       <w:r>
         <w:rPr>
           <w:rFonts w:hint="cs"/>
         </w:rPr>
-        <w:t xml:space="preserve"> ולא </w:t>
+        <w:t xml:space="preserve"> או </w:t>
       </w:r>
       <w:r>
         <w:rPr>
@@ -132,7 +110,16 @@
         <w:rPr>
           <w:rFonts w:hint="cs"/>
         </w:rPr>
-        <w:t xml:space="preserve"> מתחת ל 40 פעימות בדקה</w:t>
+        <w:t xml:space="preserve"> מתחת ל 40 פעימות בדקה אבל לא חבלה קהה וגם המטופל מציג סימני חיים</w:t>
+      </w:r>
+    </w:p>
+    <w:p/>
+    <w:p>
+      <w:r>
+        <w:rPr>
+          <w:rFonts w:hint="cs"/>
+        </w:rPr>
+        <w:t>3. תנאים להפסקת ביצוע פעולות החייאה</w:t>
       </w:r>
     </w:p>
     <w:p>
@@ -158,87 +145,46 @@
         <w:rPr>
           <w:rFonts w:hint="cs"/>
         </w:rPr>
-        <w:t xml:space="preserve"> מתחת ל 40 פעימות בדקה אבל לא חבלה קהה וגם המטופל מציג סימני חיים</w:t>
-      </w:r>
-    </w:p>
-    <w:p>
-      <w:pPr>
+        <w:t xml:space="preserve"> מתחת ל 40 פעימות בדקה וחבלה קהה</w:t>
+      </w:r>
+    </w:p>
+    <w:p>
+      <w:r>
+        <w:rPr>
+          <w:rtl w:val="0"/>
+        </w:rPr>
+        <w:t>Asystole</w:t>
+      </w:r>
+      <w:r>
         <w:rPr>
           <w:rFonts w:hint="cs"/>
         </w:rPr>
-      </w:pPr>
-    </w:p>
-    <w:p>
+        <w:t xml:space="preserve"> או </w:t>
+      </w:r>
+      <w:r>
+        <w:rPr>
+          <w:rtl w:val="0"/>
+        </w:rPr>
+        <w:t>pea</w:t>
+      </w:r>
       <w:r>
         <w:rPr>
           <w:rFonts w:hint="cs"/>
         </w:rPr>
-        <w:t>3. תנאים להפסקת ביצוע פעולות החייאה</w:t>
-      </w:r>
-    </w:p>
-    <w:p>
-      <w:r>
-        <w:rPr>
-          <w:rtl w:val="0"/>
-        </w:rPr>
-        <w:t>Asystole</w:t>
-      </w:r>
+        <w:t xml:space="preserve"> מתחת ל 40 פעימות בדקה או אם לא חבלה קהה אז גם ללא סימני חיים</w:t>
+      </w:r>
+    </w:p>
+    <w:p>
+      <w:r>
+        <w:t>בכל מקרה של הפסקת החייאה: תעד את קצב הלב, הזמן משטרה, מלא דוח רפואי ודווח מוכנות למוקד המרחבי</w:t>
+      </w:r>
+    </w:p>
+    <w:p/>
+    <w:p>
       <w:r>
         <w:rPr>
           <w:rFonts w:hint="cs"/>
         </w:rPr>
-        <w:t xml:space="preserve"> או </w:t>
-      </w:r>
-      <w:r>
-        <w:rPr>
-          <w:rtl w:val="0"/>
-        </w:rPr>
-        <w:t>pea</w:t>
-      </w:r>
-      <w:r>
-        <w:rPr>
-          <w:rFonts w:hint="cs"/>
-        </w:rPr>
-        <w:t xml:space="preserve"> מתחת ל 40 פעימות בדקה וחבלה קהה</w:t>
-      </w:r>
-    </w:p>
-    <w:p>
-      <w:r>
-        <w:rPr>
-          <w:rtl w:val="0"/>
-        </w:rPr>
-        <w:t>Asystole</w:t>
-      </w:r>
-      <w:r>
-        <w:rPr>
-          <w:rFonts w:hint="cs"/>
-        </w:rPr>
-        <w:t xml:space="preserve"> או </w:t>
-      </w:r>
-      <w:r>
-        <w:rPr>
-          <w:rtl w:val="0"/>
-        </w:rPr>
-        <w:t>pea</w:t>
-      </w:r>
-      <w:r>
-        <w:rPr>
-          <w:rFonts w:hint="cs"/>
-        </w:rPr>
-        <w:t xml:space="preserve"> מתחת ל 40 פעימות בדקה או אם לא חבלה קהה אז גם ללא סימני חיים</w:t>
-      </w:r>
-    </w:p>
-    <w:p>
-      <w:r>
-        <w:t>בכל מקרה של הפסקת החייאה: תעד את קצב הלב, הזמן משטרה, מלא דוח רפואי ודווח מוכנות למוקד המרחבי</w:t>
-      </w:r>
-    </w:p>
-    <w:p/>
-    <w:p>
-      <w:r>
-        <w:rPr>
-          <w:rFonts w:hint="cs"/>
-        </w:rPr>
         <w:t>4. לא מפסיקים החייאה במקרים הבאים</w:t>
       </w:r>
     </w:p>
@@ -253,21 +199,8 @@
       </w:r>
     </w:p>
     <w:p>
-      <w:proofErr w:type="spellStart"/>
-      <w:r>
-        <w:t>תת־חום</w:t>
-      </w:r>
-      <w:proofErr w:type="spellEnd"/>
-      <w:r>
-        <w:t xml:space="preserve"> (</w:t>
-      </w:r>
-      <w:proofErr w:type="spellStart"/>
-      <w:r>
-        <w:t>היפותרמיה</w:t>
-      </w:r>
-      <w:proofErr w:type="spellEnd"/>
-      <w:r>
-        <w:t>) קשה</w:t>
+      <w:r>
+        <w:t>תת־חום (היפותרמיה) קשה</w:t>
       </w:r>
     </w:p>
     <w:p>
@@ -472,29 +405,8 @@
       </w:r>
     </w:p>
     <w:p>
-      <w:proofErr w:type="spellStart"/>
-      <w:r>
-        <w:t>צפידת</w:t>
-      </w:r>
-      <w:proofErr w:type="spellEnd"/>
-      <w:r>
-        <w:t xml:space="preserve"> מוות (</w:t>
-      </w:r>
-      <w:proofErr w:type="spellStart"/>
-      <w:r>
-        <w:t>Rigor</w:t>
-      </w:r>
-      <w:proofErr w:type="spellEnd"/>
-      <w:r>
-        <w:t xml:space="preserve"> </w:t>
-      </w:r>
-      <w:proofErr w:type="spellStart"/>
-      <w:r>
-        <w:t>Mortis</w:t>
-      </w:r>
-      <w:proofErr w:type="spellEnd"/>
-      <w:r>
-        <w:t>)</w:t>
+      <w:r>
+        <w:t>צפידת מוות (Rigor Mortis)</w:t>
       </w:r>
     </w:p>
     <w:p>
@@ -504,23 +416,7 @@
     </w:p>
     <w:p>
       <w:r>
-        <w:t>כתמי מוות מפושטים (</w:t>
-      </w:r>
-      <w:proofErr w:type="spellStart"/>
-      <w:r>
-        <w:t>Livor</w:t>
-      </w:r>
-      <w:proofErr w:type="spellEnd"/>
-      <w:r>
-        <w:t xml:space="preserve"> </w:t>
-      </w:r>
-      <w:proofErr w:type="spellStart"/>
-      <w:r>
-        <w:t>Mortis</w:t>
-      </w:r>
-      <w:proofErr w:type="spellEnd"/>
-      <w:r>
-        <w:t>)</w:t>
+        <w:t>כתמי מוות מפושטים (Livor Mortis)</w:t>
       </w:r>
     </w:p>
     <w:p/>
@@ -737,7 +633,6 @@
         </w:rPr>
         <w:t xml:space="preserve"> </w:t>
       </w:r>
-      <w:proofErr w:type="spellStart"/>
       <w:r>
         <w:rPr>
           <w:rFonts w:ascii="David" w:hAnsi="David" w:cs="David"/>
@@ -746,7 +641,6 @@
         </w:rPr>
         <w:t>ספיק</w:t>
       </w:r>
-      <w:proofErr w:type="spellEnd"/>
       <w:r>
         <w:rPr>
           <w:rFonts w:ascii="David" w:hAnsi="David" w:cs="David" w:hint="cs"/>
@@ -917,18 +811,8 @@
           <w:sz w:val="28"/>
           <w:szCs w:val="28"/>
         </w:rPr>
-        <w:t>•</w:t>
-      </w:r>
-      <w:proofErr w:type="spellStart"/>
-      <w:r>
-        <w:rPr>
-          <w:rFonts w:ascii="David" w:hAnsi="David" w:cs="David"/>
-          <w:sz w:val="28"/>
-          <w:szCs w:val="28"/>
-        </w:rPr>
-        <w:t>היפוקסיה</w:t>
-      </w:r>
-      <w:proofErr w:type="spellEnd"/>
+        <w:t>•היפוקסיה</w:t>
+      </w:r>
       <w:r>
         <w:rPr>
           <w:rFonts w:ascii="David" w:hAnsi="David" w:cs="David" w:hint="cs"/>
@@ -1553,25 +1437,7 @@
           <w:sz w:val="28"/>
           <w:szCs w:val="28"/>
         </w:rPr>
-        <w:t xml:space="preserve">• עלול לדמות </w:t>
-      </w:r>
-      <w:proofErr w:type="spellStart"/>
-      <w:r>
-        <w:rPr>
-          <w:rFonts w:ascii="David" w:hAnsi="David" w:cs="David"/>
-          <w:sz w:val="28"/>
-          <w:szCs w:val="28"/>
-        </w:rPr>
-        <w:t>קשיון</w:t>
-      </w:r>
-      <w:proofErr w:type="spellEnd"/>
-      <w:r>
-        <w:rPr>
-          <w:rFonts w:ascii="David" w:hAnsi="David" w:cs="David"/>
-          <w:sz w:val="28"/>
-          <w:szCs w:val="28"/>
-        </w:rPr>
-        <w:t xml:space="preserve"> איברים</w:t>
+        <w:t>• עלול לדמות קשיון איברים</w:t>
       </w:r>
     </w:p>
     <w:p>
@@ -1622,18 +1488,8 @@
           <w:sz w:val="28"/>
           <w:szCs w:val="28"/>
         </w:rPr>
-        <w:t xml:space="preserve">בגברים - ייתכן </w:t>
-      </w:r>
-      <w:proofErr w:type="spellStart"/>
-      <w:r>
-        <w:rPr>
-          <w:rFonts w:ascii="David" w:hAnsi="David" w:cs="David"/>
-          <w:sz w:val="28"/>
-          <w:szCs w:val="28"/>
-        </w:rPr>
-        <w:t>פריאפיזם</w:t>
-      </w:r>
-      <w:proofErr w:type="spellEnd"/>
+        <w:t>בגברים - ייתכן פריאפיזם</w:t>
+      </w:r>
     </w:p>
     <w:p>
       <w:pPr>
@@ -1922,18 +1778,8 @@
           <w:sz w:val="28"/>
           <w:szCs w:val="28"/>
         </w:rPr>
-        <w:t xml:space="preserve">לא כל תלייה מובילה למוות </w:t>
-      </w:r>
-      <w:proofErr w:type="spellStart"/>
-      <w:r>
-        <w:rPr>
-          <w:rFonts w:ascii="David" w:hAnsi="David" w:cs="David"/>
-          <w:sz w:val="28"/>
-          <w:szCs w:val="28"/>
-        </w:rPr>
-        <w:t>מיידי</w:t>
-      </w:r>
-      <w:proofErr w:type="spellEnd"/>
+        <w:t>לא כל תלייה מובילה למוות מיידי</w:t>
+      </w:r>
     </w:p>
     <w:p>
       <w:pPr>
@@ -1983,25 +1829,7 @@
           <w:sz w:val="28"/>
           <w:szCs w:val="28"/>
         </w:rPr>
-        <w:t>• בעת זיהוי סימני מוות ודאיים (</w:t>
-      </w:r>
-      <w:proofErr w:type="spellStart"/>
-      <w:r>
-        <w:rPr>
-          <w:rFonts w:ascii="David" w:hAnsi="David" w:cs="David"/>
-          <w:sz w:val="28"/>
-          <w:szCs w:val="28"/>
-        </w:rPr>
-        <w:t>קשיון</w:t>
-      </w:r>
-      <w:proofErr w:type="spellEnd"/>
-      <w:r>
-        <w:rPr>
-          <w:rFonts w:ascii="David" w:hAnsi="David" w:cs="David"/>
-          <w:sz w:val="28"/>
-          <w:szCs w:val="28"/>
-        </w:rPr>
-        <w:t>, רקבון, ניתוק הראש) - יש להיוועץ במוקד הרפואי</w:t>
+        <w:t>• בעת זיהוי סימני מוות ודאיים (קשיון, רקבון, ניתוק הראש) - יש להיוועץ במוקד הרפואי</w:t>
       </w:r>
     </w:p>
     <w:p>
@@ -2158,25 +1986,7 @@
           <w:sz w:val="28"/>
           <w:szCs w:val="28"/>
         </w:rPr>
-        <w:t>קרדיו-</w:t>
-      </w:r>
-      <w:proofErr w:type="spellStart"/>
-      <w:r>
-        <w:rPr>
-          <w:rFonts w:ascii="David" w:hAnsi="David" w:cs="David"/>
-          <w:sz w:val="28"/>
-          <w:szCs w:val="28"/>
-        </w:rPr>
-        <w:t>ווסקולרית</w:t>
-      </w:r>
-      <w:proofErr w:type="spellEnd"/>
-      <w:r>
-        <w:rPr>
-          <w:rFonts w:ascii="David" w:hAnsi="David" w:cs="David"/>
-          <w:sz w:val="28"/>
-          <w:szCs w:val="28"/>
-        </w:rPr>
-        <w:t>:</w:t>
+        <w:t>קרדיו-ווסקולרית:</w:t>
       </w:r>
     </w:p>
     <w:p>
@@ -2210,45 +2020,25 @@
           <w:sz w:val="28"/>
           <w:szCs w:val="28"/>
         </w:rPr>
-        <w:t xml:space="preserve">• </w:t>
-      </w:r>
-      <w:proofErr w:type="spellStart"/>
-      <w:r>
-        <w:rPr>
-          <w:rFonts w:ascii="David" w:hAnsi="David" w:cs="David"/>
-          <w:sz w:val="28"/>
-          <w:szCs w:val="28"/>
-        </w:rPr>
-        <w:t>היפוולמיה</w:t>
-      </w:r>
-      <w:proofErr w:type="spellEnd"/>
-    </w:p>
-    <w:p>
-      <w:pPr>
-        <w:rPr>
-          <w:rFonts w:ascii="David" w:hAnsi="David" w:cs="David"/>
-          <w:sz w:val="28"/>
-          <w:szCs w:val="28"/>
-        </w:rPr>
-      </w:pPr>
-      <w:r>
-        <w:rPr>
-          <w:rFonts w:ascii="David" w:hAnsi="David" w:cs="David"/>
-          <w:sz w:val="28"/>
-          <w:szCs w:val="28"/>
-        </w:rPr>
-        <w:t xml:space="preserve">• הפרעות </w:t>
-      </w:r>
-      <w:proofErr w:type="spellStart"/>
-      <w:r>
-        <w:rPr>
-          <w:rFonts w:ascii="David" w:hAnsi="David" w:cs="David"/>
-          <w:sz w:val="28"/>
-          <w:szCs w:val="28"/>
-        </w:rPr>
-        <w:t>אלקטרוליטריות</w:t>
-      </w:r>
-      <w:proofErr w:type="spellEnd"/>
+        <w:t>• היפוולמיה</w:t>
+      </w:r>
+    </w:p>
+    <w:p>
+      <w:pPr>
+        <w:rPr>
+          <w:rFonts w:ascii="David" w:hAnsi="David" w:cs="David"/>
+          <w:sz w:val="28"/>
+          <w:szCs w:val="28"/>
+        </w:rPr>
+      </w:pPr>
+      <w:r>
+        <w:rPr>
+          <w:rFonts w:ascii="David" w:hAnsi="David" w:cs="David"/>
+          <w:sz w:val="28"/>
+          <w:szCs w:val="28"/>
+        </w:rPr>
+        <w:t>• הפרעות אלקטרוליטריות</w:t>
+      </w:r>
     </w:p>
     <w:p>
       <w:pPr>
@@ -2281,18 +2071,8 @@
           <w:sz w:val="28"/>
           <w:szCs w:val="28"/>
         </w:rPr>
-        <w:t xml:space="preserve">• </w:t>
-      </w:r>
-      <w:proofErr w:type="spellStart"/>
-      <w:r>
-        <w:rPr>
-          <w:rFonts w:ascii="David" w:hAnsi="David" w:cs="David"/>
-          <w:sz w:val="28"/>
-          <w:szCs w:val="28"/>
-        </w:rPr>
-        <w:t>היפוקסמיה</w:t>
-      </w:r>
-      <w:proofErr w:type="spellEnd"/>
+        <w:t>• היפוקסמיה</w:t>
+      </w:r>
     </w:p>
     <w:p>
       <w:pPr>
@@ -2582,45 +2362,25 @@
           <w:sz w:val="28"/>
           <w:szCs w:val="28"/>
         </w:rPr>
-        <w:t xml:space="preserve">תיקון </w:t>
-      </w:r>
-      <w:proofErr w:type="spellStart"/>
-      <w:r>
-        <w:rPr>
-          <w:rFonts w:ascii="David" w:hAnsi="David" w:cs="David"/>
-          <w:sz w:val="28"/>
-          <w:szCs w:val="28"/>
-        </w:rPr>
-        <w:t>היפוקסיה</w:t>
-      </w:r>
-      <w:proofErr w:type="spellEnd"/>
-    </w:p>
-    <w:p>
-      <w:pPr>
-        <w:rPr>
-          <w:rFonts w:ascii="David" w:hAnsi="David" w:cs="David"/>
-          <w:sz w:val="28"/>
-          <w:szCs w:val="28"/>
-        </w:rPr>
-      </w:pPr>
-      <w:r>
-        <w:rPr>
-          <w:rFonts w:ascii="David" w:hAnsi="David" w:cs="David"/>
-          <w:sz w:val="28"/>
-          <w:szCs w:val="28"/>
-        </w:rPr>
-        <w:t>שימור יציבות קרדיו-</w:t>
-      </w:r>
-      <w:proofErr w:type="spellStart"/>
-      <w:r>
-        <w:rPr>
-          <w:rFonts w:ascii="David" w:hAnsi="David" w:cs="David"/>
-          <w:sz w:val="28"/>
-          <w:szCs w:val="28"/>
-        </w:rPr>
-        <w:t>ווסקולרית</w:t>
-      </w:r>
-      <w:proofErr w:type="spellEnd"/>
+        <w:t>תיקון היפוקסיה</w:t>
+      </w:r>
+    </w:p>
+    <w:p>
+      <w:pPr>
+        <w:rPr>
+          <w:rFonts w:ascii="David" w:hAnsi="David" w:cs="David"/>
+          <w:sz w:val="28"/>
+          <w:szCs w:val="28"/>
+        </w:rPr>
+      </w:pPr>
+      <w:r>
+        <w:rPr>
+          <w:rFonts w:ascii="David" w:hAnsi="David" w:cs="David"/>
+          <w:sz w:val="28"/>
+          <w:szCs w:val="28"/>
+        </w:rPr>
+        <w:t>שימור יציבות קרדיו-ווסקולרית</w:t>
+      </w:r>
     </w:p>
     <w:p>
       <w:pPr>
@@ -2704,53 +2464,25 @@
           <w:sz w:val="28"/>
           <w:szCs w:val="28"/>
         </w:rPr>
-        <w:t xml:space="preserve">ייחודי למי המלח – מתן </w:t>
-      </w:r>
-      <w:proofErr w:type="spellStart"/>
-      <w:r>
-        <w:rPr>
-          <w:rFonts w:ascii="David" w:hAnsi="David" w:cs="David"/>
-          <w:sz w:val="28"/>
-          <w:szCs w:val="28"/>
-        </w:rPr>
-        <w:t>פוסיד</w:t>
-      </w:r>
-      <w:proofErr w:type="spellEnd"/>
-      <w:r>
-        <w:rPr>
-          <w:rFonts w:ascii="David" w:hAnsi="David" w:cs="David"/>
-          <w:sz w:val="28"/>
-          <w:szCs w:val="28"/>
-        </w:rPr>
-        <w:t>.</w:t>
-      </w:r>
-    </w:p>
-    <w:p>
-      <w:pPr>
-        <w:rPr>
-          <w:rFonts w:ascii="David" w:hAnsi="David" w:cs="David"/>
-          <w:sz w:val="28"/>
-          <w:szCs w:val="28"/>
-        </w:rPr>
-      </w:pPr>
-      <w:r>
-        <w:rPr>
-          <w:rFonts w:ascii="David" w:hAnsi="David" w:cs="David"/>
-          <w:sz w:val="28"/>
-          <w:szCs w:val="28"/>
-        </w:rPr>
-        <w:t xml:space="preserve">• לטיפול פוטנציאלי בהפרעות </w:t>
-      </w:r>
-      <w:proofErr w:type="spellStart"/>
-      <w:r>
-        <w:rPr>
-          <w:rFonts w:ascii="David" w:hAnsi="David" w:cs="David"/>
-          <w:sz w:val="28"/>
-          <w:szCs w:val="28"/>
-        </w:rPr>
-        <w:t>האלקטרוליטריות</w:t>
-      </w:r>
-      <w:proofErr w:type="spellEnd"/>
+        <w:t>ייחודי למי המלח – מתן פוסיד.</w:t>
+      </w:r>
+    </w:p>
+    <w:p>
+      <w:pPr>
+        <w:rPr>
+          <w:rFonts w:ascii="David" w:hAnsi="David" w:cs="David"/>
+          <w:sz w:val="28"/>
+          <w:szCs w:val="28"/>
+        </w:rPr>
+      </w:pPr>
+      <w:r>
+        <w:rPr>
+          <w:rFonts w:ascii="David" w:hAnsi="David" w:cs="David"/>
+          <w:sz w:val="28"/>
+          <w:szCs w:val="28"/>
+        </w:rPr>
+        <w:t>• לטיפול פוטנציאלי בהפרעות האלקטרוליטריות</w:t>
+      </w:r>
     </w:p>
     <w:p>
       <w:pPr>
@@ -2945,25 +2677,7 @@
           <w:sz w:val="28"/>
           <w:szCs w:val="28"/>
         </w:rPr>
-        <w:t xml:space="preserve">• במקרי </w:t>
-      </w:r>
-      <w:proofErr w:type="spellStart"/>
-      <w:r>
-        <w:rPr>
-          <w:rFonts w:ascii="David" w:hAnsi="David" w:cs="David"/>
-          <w:sz w:val="28"/>
-          <w:szCs w:val="28"/>
-        </w:rPr>
-        <w:t>היפותרמיה</w:t>
-      </w:r>
-      <w:proofErr w:type="spellEnd"/>
-      <w:r>
-        <w:rPr>
-          <w:rFonts w:ascii="David" w:hAnsi="David" w:cs="David"/>
-          <w:sz w:val="28"/>
-          <w:szCs w:val="28"/>
-        </w:rPr>
-        <w:t xml:space="preserve"> - אין להפסיק פעולות החייאה</w:t>
+        <w:t>• במקרי היפותרמיה - אין להפסיק פעולות החייאה</w:t>
       </w:r>
     </w:p>
     <w:p>
@@ -3258,25 +2972,7 @@
           <w:szCs w:val="28"/>
         </w:rPr>
         <w:lastRenderedPageBreak/>
-        <w:t xml:space="preserve">טיפול סימפטומטי לפי פרוטוקול מתאים (פרכוסים, </w:t>
-      </w:r>
-      <w:proofErr w:type="spellStart"/>
-      <w:r>
-        <w:rPr>
-          <w:rFonts w:ascii="David" w:hAnsi="David" w:cs="David"/>
-          <w:sz w:val="28"/>
-          <w:szCs w:val="28"/>
-        </w:rPr>
-        <w:t>אנאפילקסיס</w:t>
-      </w:r>
-      <w:proofErr w:type="spellEnd"/>
-      <w:r>
-        <w:rPr>
-          <w:rFonts w:ascii="David" w:hAnsi="David" w:cs="David"/>
-          <w:sz w:val="28"/>
-          <w:szCs w:val="28"/>
-        </w:rPr>
-        <w:t>...)</w:t>
+        <w:t>טיפול סימפטומטי לפי פרוטוקול מתאים (פרכוסים, אנאפילקסיס...)</w:t>
       </w:r>
     </w:p>
     <w:p>
@@ -3567,106 +3263,42 @@
           <w:sz w:val="28"/>
           <w:szCs w:val="28"/>
         </w:rPr>
-        <w:t xml:space="preserve">תגובה </w:t>
-      </w:r>
-      <w:proofErr w:type="spellStart"/>
-      <w:r>
-        <w:rPr>
-          <w:rFonts w:ascii="David" w:hAnsi="David" w:cs="David"/>
-          <w:sz w:val="28"/>
-          <w:szCs w:val="28"/>
-        </w:rPr>
-        <w:t>אנאפילקטואידית</w:t>
-      </w:r>
-      <w:proofErr w:type="spellEnd"/>
-      <w:r>
-        <w:rPr>
-          <w:rFonts w:ascii="David" w:hAnsi="David" w:cs="David"/>
-          <w:sz w:val="28"/>
-          <w:szCs w:val="28"/>
-        </w:rPr>
-        <w:t xml:space="preserve"> (דמוית </w:t>
-      </w:r>
-      <w:proofErr w:type="spellStart"/>
-      <w:r>
-        <w:rPr>
-          <w:rFonts w:ascii="David" w:hAnsi="David" w:cs="David"/>
-          <w:sz w:val="28"/>
-          <w:szCs w:val="28"/>
-        </w:rPr>
-        <w:t>אנאפילקסיס</w:t>
-      </w:r>
-      <w:proofErr w:type="spellEnd"/>
-      <w:r>
-        <w:rPr>
-          <w:rFonts w:ascii="David" w:hAnsi="David" w:cs="David"/>
-          <w:sz w:val="28"/>
-          <w:szCs w:val="28"/>
-        </w:rPr>
-        <w:t>)</w:t>
-      </w:r>
-    </w:p>
-    <w:p>
-      <w:pPr>
-        <w:rPr>
-          <w:rFonts w:ascii="David" w:hAnsi="David" w:cs="David"/>
-          <w:sz w:val="28"/>
-          <w:szCs w:val="28"/>
-        </w:rPr>
-      </w:pPr>
-      <w:r>
-        <w:rPr>
-          <w:rFonts w:ascii="David" w:hAnsi="David" w:cs="David"/>
-          <w:sz w:val="28"/>
-          <w:szCs w:val="28"/>
-        </w:rPr>
-        <w:t xml:space="preserve">• תגובה המדמה תגובה </w:t>
-      </w:r>
-      <w:proofErr w:type="spellStart"/>
-      <w:r>
-        <w:rPr>
-          <w:rFonts w:ascii="David" w:hAnsi="David" w:cs="David"/>
-          <w:sz w:val="28"/>
-          <w:szCs w:val="28"/>
-        </w:rPr>
-        <w:t>אנאפילקטית</w:t>
-      </w:r>
-      <w:proofErr w:type="spellEnd"/>
-      <w:r>
-        <w:rPr>
-          <w:rFonts w:ascii="David" w:hAnsi="David" w:cs="David"/>
-          <w:sz w:val="28"/>
-          <w:szCs w:val="28"/>
-        </w:rPr>
-        <w:t xml:space="preserve"> אולם במנגנון מעט שונה</w:t>
-      </w:r>
-    </w:p>
-    <w:p>
-      <w:pPr>
-        <w:rPr>
-          <w:rFonts w:ascii="David" w:hAnsi="David" w:cs="David"/>
-          <w:sz w:val="28"/>
-          <w:szCs w:val="28"/>
-        </w:rPr>
-      </w:pPr>
-      <w:r>
-        <w:rPr>
-          <w:rFonts w:ascii="David" w:hAnsi="David" w:cs="David"/>
-          <w:sz w:val="28"/>
-          <w:szCs w:val="28"/>
-        </w:rPr>
-        <w:t xml:space="preserve">תגובה </w:t>
-      </w:r>
-      <w:proofErr w:type="spellStart"/>
-      <w:r>
-        <w:rPr>
-          <w:rFonts w:ascii="David" w:hAnsi="David" w:cs="David"/>
-          <w:sz w:val="28"/>
-          <w:szCs w:val="28"/>
-        </w:rPr>
-        <w:t>נוירוטוקסית</w:t>
-      </w:r>
-      <w:proofErr w:type="spellEnd"/>
+        <w:t>תגובה אנאפילקטואידית (דמוית אנאפילקסיס)</w:t>
+      </w:r>
+    </w:p>
+    <w:p>
+      <w:pPr>
+        <w:rPr>
+          <w:rFonts w:ascii="David" w:hAnsi="David" w:cs="David"/>
+          <w:sz w:val="28"/>
+          <w:szCs w:val="28"/>
+        </w:rPr>
+      </w:pPr>
+      <w:r>
+        <w:rPr>
+          <w:rFonts w:ascii="David" w:hAnsi="David" w:cs="David"/>
+          <w:sz w:val="28"/>
+          <w:szCs w:val="28"/>
+        </w:rPr>
+        <w:t>• תגובה המדמה תגובה אנאפילקטית אולם במנגנון מעט שונה</w:t>
+      </w:r>
+    </w:p>
+    <w:p>
+      <w:pPr>
+        <w:rPr>
+          <w:rFonts w:ascii="David" w:hAnsi="David" w:cs="David"/>
+          <w:sz w:val="28"/>
+          <w:szCs w:val="28"/>
+        </w:rPr>
+      </w:pPr>
+      <w:r>
+        <w:rPr>
+          <w:rFonts w:ascii="David" w:hAnsi="David" w:cs="David"/>
+          <w:sz w:val="28"/>
+          <w:szCs w:val="28"/>
+        </w:rPr>
+        <w:t>תגובה נוירוטוקסית</w:t>
+      </w:r>
     </w:p>
     <w:p>
       <w:pPr>
@@ -3716,70 +3348,24 @@
           <w:sz w:val="28"/>
           <w:szCs w:val="28"/>
         </w:rPr>
-        <w:t xml:space="preserve">• נפיחות מקומית הנגרמת על ידי פגיעה בתאי </w:t>
-      </w:r>
-      <w:proofErr w:type="spellStart"/>
-      <w:r>
-        <w:rPr>
-          <w:rFonts w:ascii="David" w:hAnsi="David" w:cs="David"/>
-          <w:sz w:val="28"/>
-          <w:szCs w:val="28"/>
-        </w:rPr>
-        <w:t>אנדותל</w:t>
-      </w:r>
-      <w:proofErr w:type="spellEnd"/>
-      <w:r>
-        <w:rPr>
-          <w:rFonts w:ascii="David" w:hAnsi="David" w:cs="David"/>
-          <w:sz w:val="28"/>
-          <w:szCs w:val="28"/>
-        </w:rPr>
-        <w:t xml:space="preserve"> והגברת החדירות של </w:t>
-      </w:r>
-      <w:proofErr w:type="spellStart"/>
-      <w:r>
-        <w:rPr>
-          <w:rFonts w:ascii="David" w:hAnsi="David" w:cs="David"/>
-          <w:sz w:val="28"/>
-          <w:szCs w:val="28"/>
-        </w:rPr>
-        <w:t>קפילרות</w:t>
-      </w:r>
-      <w:proofErr w:type="spellEnd"/>
-    </w:p>
-    <w:p>
-      <w:pPr>
-        <w:rPr>
-          <w:rFonts w:ascii="David" w:hAnsi="David" w:cs="David"/>
-          <w:sz w:val="28"/>
-          <w:szCs w:val="28"/>
-        </w:rPr>
-      </w:pPr>
-      <w:r>
-        <w:rPr>
-          <w:rFonts w:ascii="David" w:hAnsi="David" w:cs="David"/>
-          <w:sz w:val="28"/>
-          <w:szCs w:val="28"/>
-        </w:rPr>
-        <w:t xml:space="preserve">• פגיעה </w:t>
-      </w:r>
-      <w:proofErr w:type="spellStart"/>
-      <w:r>
-        <w:rPr>
-          <w:rFonts w:ascii="David" w:hAnsi="David" w:cs="David"/>
-          <w:sz w:val="28"/>
-          <w:szCs w:val="28"/>
-        </w:rPr>
-        <w:t>בפקטורי</w:t>
-      </w:r>
-      <w:proofErr w:type="spellEnd"/>
-      <w:r>
-        <w:rPr>
-          <w:rFonts w:ascii="David" w:hAnsi="David" w:cs="David"/>
-          <w:sz w:val="28"/>
-          <w:szCs w:val="28"/>
-        </w:rPr>
-        <w:t xml:space="preserve"> הקרישה</w:t>
+        <w:t>• נפיחות מקומית הנגרמת על ידי פגיעה בתאי אנדותל והגברת החדירות של קפילרות</w:t>
+      </w:r>
+    </w:p>
+    <w:p>
+      <w:pPr>
+        <w:rPr>
+          <w:rFonts w:ascii="David" w:hAnsi="David" w:cs="David"/>
+          <w:sz w:val="28"/>
+          <w:szCs w:val="28"/>
+        </w:rPr>
+      </w:pPr>
+      <w:r>
+        <w:rPr>
+          <w:rFonts w:ascii="David" w:hAnsi="David" w:cs="David"/>
+          <w:sz w:val="28"/>
+          <w:szCs w:val="28"/>
+        </w:rPr>
+        <w:t>• פגיעה בפקטורי הקרישה</w:t>
       </w:r>
     </w:p>
     <w:p>
@@ -3913,25 +3499,7 @@
           <w:sz w:val="28"/>
           <w:szCs w:val="28"/>
         </w:rPr>
-        <w:t xml:space="preserve">• כאב, נפיחות, שלפוחיות, </w:t>
-      </w:r>
-      <w:proofErr w:type="spellStart"/>
-      <w:r>
-        <w:rPr>
-          <w:rFonts w:ascii="David" w:hAnsi="David" w:cs="David"/>
-          <w:sz w:val="28"/>
-          <w:szCs w:val="28"/>
-        </w:rPr>
-        <w:t>המטומות</w:t>
-      </w:r>
-      <w:proofErr w:type="spellEnd"/>
-      <w:r>
-        <w:rPr>
-          <w:rFonts w:ascii="David" w:hAnsi="David" w:cs="David"/>
-          <w:sz w:val="28"/>
-          <w:szCs w:val="28"/>
-        </w:rPr>
-        <w:t>, דימום פנימי</w:t>
+        <w:t>• כאב, נפיחות, שלפוחיות, המטומות, דימום פנימי</w:t>
       </w:r>
     </w:p>
     <w:p>
@@ -4033,18 +3601,8 @@
           <w:sz w:val="28"/>
           <w:szCs w:val="28"/>
         </w:rPr>
-        <w:t xml:space="preserve">• שוק </w:t>
-      </w:r>
-      <w:proofErr w:type="spellStart"/>
-      <w:r>
-        <w:rPr>
-          <w:rFonts w:ascii="David" w:hAnsi="David" w:cs="David"/>
-          <w:sz w:val="28"/>
-          <w:szCs w:val="28"/>
-        </w:rPr>
-        <w:t>קרדיוגני</w:t>
-      </w:r>
-      <w:proofErr w:type="spellEnd"/>
+        <w:t>• שוק קרדיוגני</w:t>
+      </w:r>
     </w:p>
     <w:p>
       <w:pPr>
@@ -4165,53 +3723,25 @@
           <w:sz w:val="28"/>
           <w:szCs w:val="28"/>
         </w:rPr>
-        <w:t>• הפרשה רציפה של המתווך "</w:t>
-      </w:r>
-      <w:proofErr w:type="spellStart"/>
-      <w:r>
-        <w:rPr>
-          <w:rFonts w:ascii="David" w:hAnsi="David" w:cs="David"/>
-          <w:sz w:val="28"/>
-          <w:szCs w:val="28"/>
-        </w:rPr>
-        <w:t>אצטילכולין</w:t>
-      </w:r>
-      <w:proofErr w:type="spellEnd"/>
-      <w:r>
-        <w:rPr>
-          <w:rFonts w:ascii="David" w:hAnsi="David" w:cs="David"/>
-          <w:sz w:val="28"/>
-          <w:szCs w:val="28"/>
-        </w:rPr>
-        <w:t>"</w:t>
-      </w:r>
-    </w:p>
-    <w:p>
-      <w:pPr>
-        <w:rPr>
-          <w:rFonts w:ascii="David" w:hAnsi="David" w:cs="David"/>
-          <w:sz w:val="28"/>
-          <w:szCs w:val="28"/>
-        </w:rPr>
-      </w:pPr>
-      <w:r>
-        <w:rPr>
-          <w:rFonts w:ascii="David" w:hAnsi="David" w:cs="David"/>
-          <w:sz w:val="28"/>
-          <w:szCs w:val="28"/>
-        </w:rPr>
-        <w:t xml:space="preserve">• גירוי רצוף של המערכת </w:t>
-      </w:r>
-      <w:proofErr w:type="spellStart"/>
-      <w:r>
-        <w:rPr>
-          <w:rFonts w:ascii="David" w:hAnsi="David" w:cs="David"/>
-          <w:sz w:val="28"/>
-          <w:szCs w:val="28"/>
-        </w:rPr>
-        <w:t>הפאראסימפתית</w:t>
-      </w:r>
-      <w:proofErr w:type="spellEnd"/>
+        <w:t>• הפרשה רציפה של המתווך "אצטילכולין"</w:t>
+      </w:r>
+    </w:p>
+    <w:p>
+      <w:pPr>
+        <w:rPr>
+          <w:rFonts w:ascii="David" w:hAnsi="David" w:cs="David"/>
+          <w:sz w:val="28"/>
+          <w:szCs w:val="28"/>
+        </w:rPr>
+      </w:pPr>
+      <w:r>
+        <w:rPr>
+          <w:rFonts w:ascii="David" w:hAnsi="David" w:cs="David"/>
+          <w:sz w:val="28"/>
+          <w:szCs w:val="28"/>
+        </w:rPr>
+        <w:t>• גירוי רצוף של המערכת הפאראסימפתית</w:t>
+      </w:r>
     </w:p>
     <w:p>
       <w:pPr>
@@ -4297,25 +3827,7 @@
           <w:sz w:val="28"/>
           <w:szCs w:val="28"/>
         </w:rPr>
-        <w:t xml:space="preserve">• רק במצבים חריגים ונדירים בהם ישנו שוק </w:t>
-      </w:r>
-      <w:proofErr w:type="spellStart"/>
-      <w:r>
-        <w:rPr>
-          <w:rFonts w:ascii="David" w:hAnsi="David" w:cs="David"/>
-          <w:sz w:val="28"/>
-          <w:szCs w:val="28"/>
-        </w:rPr>
-        <w:t>קרדיוגני</w:t>
-      </w:r>
-      <w:proofErr w:type="spellEnd"/>
-      <w:r>
-        <w:rPr>
-          <w:rFonts w:ascii="David" w:hAnsi="David" w:cs="David"/>
-          <w:sz w:val="28"/>
-          <w:szCs w:val="28"/>
-        </w:rPr>
-        <w:t xml:space="preserve"> משמעותי עם סימני גירוי פרא-סימפתטי מוגבר ניתן לשקול מתן של אטרופין</w:t>
+        <w:t>• רק במצבים חריגים ונדירים בהם ישנו שוק קרדיוגני משמעותי עם סימני גירוי פרא-סימפתטי מוגבר ניתן לשקול מתן של אטרופין</w:t>
       </w:r>
     </w:p>
     <w:p>
@@ -4592,36 +4104,17 @@
           <w:sz w:val="28"/>
           <w:szCs w:val="28"/>
         </w:rPr>
-        <w:t xml:space="preserve">• </w:t>
-      </w:r>
-      <w:proofErr w:type="spellStart"/>
-      <w:r>
-        <w:rPr>
-          <w:rFonts w:ascii="David" w:hAnsi="David" w:cs="David"/>
-          <w:sz w:val="28"/>
-          <w:szCs w:val="28"/>
-        </w:rPr>
-        <w:t>תקפנות</w:t>
-      </w:r>
-      <w:proofErr w:type="spellEnd"/>
-      <w:r>
-        <w:rPr>
-          <w:rFonts w:ascii="David" w:hAnsi="David" w:cs="David"/>
-          <w:sz w:val="28"/>
-          <w:szCs w:val="28"/>
-        </w:rPr>
-        <w:t xml:space="preserve"> ובהמשך אפתיה</w:t>
-      </w:r>
-    </w:p>
-    <w:p>
-      <w:pPr>
-        <w:rPr>
-          <w:rFonts w:ascii="David" w:hAnsi="David" w:cs="David"/>
-          <w:sz w:val="28"/>
-          <w:szCs w:val="28"/>
-        </w:rPr>
-      </w:pPr>
-      <w:proofErr w:type="spellStart"/>
+        <w:t>• תקפנות ובהמשך אפתיה</w:t>
+      </w:r>
+    </w:p>
+    <w:p>
+      <w:pPr>
+        <w:rPr>
+          <w:rFonts w:ascii="David" w:hAnsi="David" w:cs="David"/>
+          <w:sz w:val="28"/>
+          <w:szCs w:val="28"/>
+        </w:rPr>
+      </w:pPr>
       <w:r>
         <w:rPr>
           <w:rFonts w:ascii="David" w:hAnsi="David" w:cs="David"/>
@@ -4630,7 +4123,6 @@
         </w:rPr>
         <w:t>שיתוקים</w:t>
       </w:r>
-      <w:proofErr w:type="spellEnd"/>
     </w:p>
     <w:p>
       <w:pPr>
@@ -4775,24 +4267,6 @@
           <w:rFonts w:ascii="David" w:hAnsi="David" w:cs="David"/>
           <w:sz w:val="28"/>
           <w:szCs w:val="28"/>
-          <w:rtl w:val="0"/>
-        </w:rPr>
-      </w:pPr>
-      <w:r>
-        <w:rPr>
-          <w:rFonts w:ascii="David" w:hAnsi="David" w:cs="David"/>
-          <w:sz w:val="28"/>
-          <w:szCs w:val="28"/>
-        </w:rPr>
-        <w:t>הנה הטקסט עם רווחים בין המילים:</w:t>
-      </w:r>
-    </w:p>
-    <w:p>
-      <w:pPr>
-        <w:rPr>
-          <w:rFonts w:ascii="David" w:hAnsi="David" w:cs="David"/>
-          <w:sz w:val="28"/>
-          <w:szCs w:val="28"/>
         </w:rPr>
       </w:pPr>
       <w:r>
@@ -4903,18 +4377,8 @@
           <w:sz w:val="28"/>
           <w:szCs w:val="28"/>
         </w:rPr>
-        <w:t xml:space="preserve">• דגש על זיהוי החיה או היותה לא מוכרת / </w:t>
-      </w:r>
-      <w:proofErr w:type="spellStart"/>
-      <w:r>
-        <w:rPr>
-          <w:rFonts w:ascii="David" w:hAnsi="David" w:cs="David"/>
-          <w:sz w:val="28"/>
-          <w:szCs w:val="28"/>
-        </w:rPr>
-        <w:t>מביותת</w:t>
-      </w:r>
-      <w:proofErr w:type="spellEnd"/>
+        <w:t>• דגש על זיהוי החיה או היותה לא מוכרת / מביותת</w:t>
+      </w:r>
     </w:p>
     <w:p>
       <w:pPr>
@@ -4996,152 +4460,93 @@
           <w:sz w:val="28"/>
           <w:szCs w:val="28"/>
         </w:rPr>
-        <w:t>סימנים וסימפטומים (</w:t>
-      </w:r>
-      <w:proofErr w:type="spellStart"/>
-      <w:r>
-        <w:rPr>
-          <w:rFonts w:ascii="David" w:hAnsi="David" w:cs="David"/>
-          <w:sz w:val="28"/>
-          <w:szCs w:val="28"/>
-        </w:rPr>
-        <w:t>The</w:t>
-      </w:r>
-      <w:proofErr w:type="spellEnd"/>
-      <w:r>
-        <w:rPr>
-          <w:rFonts w:ascii="David" w:hAnsi="David" w:cs="David"/>
-          <w:sz w:val="28"/>
-          <w:szCs w:val="28"/>
-        </w:rPr>
-        <w:t xml:space="preserve"> 6 </w:t>
-      </w:r>
-      <w:proofErr w:type="spellStart"/>
-      <w:r>
-        <w:rPr>
-          <w:rFonts w:ascii="David" w:hAnsi="David" w:cs="David"/>
-          <w:sz w:val="28"/>
-          <w:szCs w:val="28"/>
-        </w:rPr>
-        <w:t>P's</w:t>
-      </w:r>
-      <w:proofErr w:type="spellEnd"/>
-      <w:r>
-        <w:rPr>
-          <w:rFonts w:ascii="David" w:hAnsi="David" w:cs="David"/>
-          <w:sz w:val="28"/>
-          <w:szCs w:val="28"/>
-        </w:rPr>
-        <w:t>)</w:t>
-      </w:r>
-    </w:p>
-    <w:p>
-      <w:pPr>
-        <w:rPr>
-          <w:rFonts w:ascii="David" w:hAnsi="David" w:cs="David"/>
-          <w:sz w:val="28"/>
-          <w:szCs w:val="28"/>
-        </w:rPr>
-      </w:pPr>
-      <w:r>
-        <w:rPr>
-          <w:rFonts w:ascii="David" w:hAnsi="David" w:cs="David"/>
-          <w:sz w:val="28"/>
-          <w:szCs w:val="28"/>
-        </w:rPr>
-        <w:t xml:space="preserve">• כאבים עזים \ שריפה בעור - </w:t>
-      </w:r>
-      <w:proofErr w:type="spellStart"/>
-      <w:r>
-        <w:rPr>
-          <w:rFonts w:ascii="David" w:hAnsi="David" w:cs="David"/>
-          <w:sz w:val="28"/>
-          <w:szCs w:val="28"/>
-        </w:rPr>
-        <w:t>Pain</w:t>
-      </w:r>
-      <w:proofErr w:type="spellEnd"/>
-    </w:p>
-    <w:p>
-      <w:pPr>
-        <w:rPr>
-          <w:rFonts w:ascii="David" w:hAnsi="David" w:cs="David"/>
-          <w:sz w:val="28"/>
-          <w:szCs w:val="28"/>
-        </w:rPr>
-      </w:pPr>
-      <w:r>
-        <w:rPr>
-          <w:rFonts w:ascii="David" w:hAnsi="David" w:cs="David"/>
-          <w:sz w:val="28"/>
-          <w:szCs w:val="28"/>
-        </w:rPr>
-        <w:t xml:space="preserve">• חוסר יכולת להניע את הגפה - </w:t>
-      </w:r>
-      <w:proofErr w:type="spellStart"/>
-      <w:r>
-        <w:rPr>
-          <w:rFonts w:ascii="David" w:hAnsi="David" w:cs="David"/>
-          <w:sz w:val="28"/>
-          <w:szCs w:val="28"/>
-        </w:rPr>
-        <w:t>Paralysis</w:t>
-      </w:r>
-      <w:proofErr w:type="spellEnd"/>
-    </w:p>
-    <w:p>
-      <w:pPr>
-        <w:rPr>
-          <w:rFonts w:ascii="David" w:hAnsi="David" w:cs="David"/>
-          <w:sz w:val="28"/>
-          <w:szCs w:val="28"/>
-        </w:rPr>
-      </w:pPr>
-      <w:r>
-        <w:rPr>
-          <w:rFonts w:ascii="David" w:hAnsi="David" w:cs="David"/>
-          <w:sz w:val="28"/>
-          <w:szCs w:val="28"/>
-        </w:rPr>
-        <w:t xml:space="preserve">• רגישות למגע - </w:t>
-      </w:r>
-      <w:proofErr w:type="spellStart"/>
-      <w:r>
-        <w:rPr>
-          <w:rFonts w:ascii="David" w:hAnsi="David" w:cs="David"/>
-          <w:sz w:val="28"/>
-          <w:szCs w:val="28"/>
-        </w:rPr>
-        <w:t>Paresthesia</w:t>
-      </w:r>
-      <w:proofErr w:type="spellEnd"/>
-    </w:p>
-    <w:p>
-      <w:pPr>
-        <w:rPr>
-          <w:rFonts w:ascii="David" w:hAnsi="David" w:cs="David"/>
-          <w:sz w:val="28"/>
-          <w:szCs w:val="28"/>
-        </w:rPr>
-      </w:pPr>
-      <w:r>
-        <w:rPr>
-          <w:rFonts w:ascii="David" w:hAnsi="David" w:cs="David"/>
-          <w:sz w:val="28"/>
-          <w:szCs w:val="28"/>
-        </w:rPr>
-        <w:t xml:space="preserve">• חיוורון הגפה - </w:t>
-      </w:r>
-      <w:proofErr w:type="spellStart"/>
-      <w:r>
-        <w:rPr>
-          <w:rFonts w:ascii="David" w:hAnsi="David" w:cs="David"/>
-          <w:sz w:val="28"/>
-          <w:szCs w:val="28"/>
-        </w:rPr>
-        <w:t>Pallor</w:t>
-      </w:r>
-      <w:proofErr w:type="spellEnd"/>
+        <w:t>סימנים וסימפטומים (The 6 P's)</w:t>
+      </w:r>
+    </w:p>
+    <w:p>
+      <w:pPr>
+        <w:rPr>
+          <w:rFonts w:ascii="David" w:hAnsi="David" w:cs="David"/>
+          <w:sz w:val="28"/>
+          <w:szCs w:val="28"/>
+        </w:rPr>
+      </w:pPr>
+      <w:r>
+        <w:rPr>
+          <w:rFonts w:ascii="David" w:hAnsi="David" w:cs="David"/>
+          <w:sz w:val="28"/>
+          <w:szCs w:val="28"/>
+        </w:rPr>
+        <w:t>• כאבים עזים \ שריפה בעור - Pain</w:t>
+      </w:r>
+    </w:p>
+    <w:p>
+      <w:pPr>
+        <w:rPr>
+          <w:rFonts w:ascii="David" w:hAnsi="David" w:cs="David"/>
+          <w:sz w:val="28"/>
+          <w:szCs w:val="28"/>
+        </w:rPr>
+      </w:pPr>
+      <w:r>
+        <w:rPr>
+          <w:rFonts w:ascii="David" w:hAnsi="David" w:cs="David"/>
+          <w:sz w:val="28"/>
+          <w:szCs w:val="28"/>
+        </w:rPr>
+        <w:t>• חוסר יכולת להניע את הגפה - Paralysis</w:t>
+      </w:r>
+    </w:p>
+    <w:p>
+      <w:pPr>
+        <w:rPr>
+          <w:rFonts w:ascii="David" w:hAnsi="David" w:cs="David"/>
+          <w:sz w:val="28"/>
+          <w:szCs w:val="28"/>
+        </w:rPr>
+      </w:pPr>
+      <w:r>
+        <w:rPr>
+          <w:rFonts w:ascii="David" w:hAnsi="David" w:cs="David"/>
+          <w:sz w:val="28"/>
+          <w:szCs w:val="28"/>
+        </w:rPr>
+        <w:t>• רגישות למגע - Paresthesia</w:t>
+      </w:r>
+    </w:p>
+    <w:p>
+      <w:pPr>
+        <w:rPr>
+          <w:rFonts w:ascii="David" w:hAnsi="David" w:cs="David"/>
+          <w:sz w:val="28"/>
+          <w:szCs w:val="28"/>
+        </w:rPr>
+      </w:pPr>
+      <w:r>
+        <w:rPr>
+          <w:rFonts w:ascii="David" w:hAnsi="David" w:cs="David"/>
+          <w:sz w:val="28"/>
+          <w:szCs w:val="28"/>
+        </w:rPr>
+        <w:t>• חיוורון הגפה - Pallor</w:t>
+      </w:r>
+    </w:p>
+    <w:p>
+      <w:pPr>
+        <w:rPr>
+          <w:rFonts w:ascii="David" w:hAnsi="David" w:cs="David"/>
+          <w:sz w:val="28"/>
+          <w:szCs w:val="28"/>
+        </w:rPr>
+      </w:pPr>
+      <w:r>
+        <w:rPr>
+          <w:rFonts w:ascii="David" w:hAnsi="David" w:cs="David"/>
+          <w:sz w:val="28"/>
+          <w:szCs w:val="28"/>
+        </w:rPr>
+        <w:t>• היעדר דופק דיסטאלי - Pulselessness</w:t>
+      </w:r>
     </w:p>
     <w:p>
       <w:pPr>
@@ -5158,63 +4563,8 @@
           <w:szCs w:val="28"/>
         </w:rPr>
         <w:lastRenderedPageBreak/>
-        <w:t xml:space="preserve">• היעדר דופק </w:t>
-      </w:r>
-      <w:proofErr w:type="spellStart"/>
-      <w:r>
-        <w:rPr>
-          <w:rFonts w:ascii="David" w:hAnsi="David" w:cs="David"/>
-          <w:sz w:val="28"/>
-          <w:szCs w:val="28"/>
-        </w:rPr>
-        <w:t>דיסטאלי</w:t>
-      </w:r>
-      <w:proofErr w:type="spellEnd"/>
-      <w:r>
-        <w:rPr>
-          <w:rFonts w:ascii="David" w:hAnsi="David" w:cs="David"/>
-          <w:sz w:val="28"/>
-          <w:szCs w:val="28"/>
-        </w:rPr>
-        <w:t xml:space="preserve"> - </w:t>
-      </w:r>
-      <w:proofErr w:type="spellStart"/>
-      <w:r>
-        <w:rPr>
-          <w:rFonts w:ascii="David" w:hAnsi="David" w:cs="David"/>
-          <w:sz w:val="28"/>
-          <w:szCs w:val="28"/>
-        </w:rPr>
-        <w:t>Pulselessness</w:t>
-      </w:r>
-      <w:proofErr w:type="spellEnd"/>
-    </w:p>
-    <w:p>
-      <w:pPr>
-        <w:rPr>
-          <w:rFonts w:ascii="David" w:hAnsi="David" w:cs="David"/>
-          <w:sz w:val="28"/>
-          <w:szCs w:val="28"/>
-        </w:rPr>
-      </w:pPr>
-      <w:r>
-        <w:rPr>
-          <w:rFonts w:ascii="David" w:hAnsi="David" w:cs="David"/>
-          <w:sz w:val="28"/>
-          <w:szCs w:val="28"/>
-        </w:rPr>
-        <w:t xml:space="preserve">• חוסר יכולת לאזן חום גוף באזור הפגוע – </w:t>
-      </w:r>
-      <w:proofErr w:type="spellStart"/>
-      <w:r>
-        <w:rPr>
-          <w:rFonts w:ascii="David" w:hAnsi="David" w:cs="David"/>
-          <w:sz w:val="28"/>
-          <w:szCs w:val="28"/>
-        </w:rPr>
-        <w:t>Poikilothermy</w:t>
-      </w:r>
-      <w:proofErr w:type="spellEnd"/>
+        <w:t>• חוסר יכולת לאזן חום גוף באזור הפגוע – Poikilothermy</w:t>
+      </w:r>
     </w:p>
     <w:p>
       <w:pPr>
@@ -5264,25 +4614,7 @@
           <w:sz w:val="28"/>
           <w:szCs w:val="28"/>
         </w:rPr>
-        <w:t xml:space="preserve">• סימני </w:t>
-      </w:r>
-      <w:proofErr w:type="spellStart"/>
-      <w:r>
-        <w:rPr>
-          <w:rFonts w:ascii="David" w:hAnsi="David" w:cs="David"/>
-          <w:sz w:val="28"/>
-          <w:szCs w:val="28"/>
-        </w:rPr>
-        <w:t>היפרקלמיה</w:t>
-      </w:r>
-      <w:proofErr w:type="spellEnd"/>
-      <w:r>
-        <w:rPr>
-          <w:rFonts w:ascii="David" w:hAnsi="David" w:cs="David"/>
-          <w:sz w:val="28"/>
-          <w:szCs w:val="28"/>
-        </w:rPr>
-        <w:t xml:space="preserve"> באק"ג</w:t>
+        <w:t>• סימני היפרקלמיה באק"ג</w:t>
       </w:r>
     </w:p>
     <w:p>
@@ -5319,7 +4651,6 @@
           <w:szCs w:val="28"/>
         </w:rPr>
       </w:pPr>
-      <w:proofErr w:type="spellStart"/>
       <w:r>
         <w:rPr>
           <w:rFonts w:ascii="David" w:hAnsi="David" w:cs="David" w:hint="cs"/>
@@ -5328,41 +4659,22 @@
         </w:rPr>
         <w:t>פתופיזיולוגיה</w:t>
       </w:r>
-      <w:proofErr w:type="spellEnd"/>
-    </w:p>
-    <w:p>
-      <w:pPr>
-        <w:rPr>
-          <w:rFonts w:ascii="David" w:hAnsi="David" w:cs="David"/>
-          <w:sz w:val="28"/>
-          <w:szCs w:val="28"/>
-        </w:rPr>
-      </w:pPr>
-      <w:r>
-        <w:rPr>
-          <w:rFonts w:ascii="David" w:hAnsi="David" w:cs="David"/>
-          <w:sz w:val="28"/>
-          <w:szCs w:val="28"/>
-        </w:rPr>
-        <w:t xml:space="preserve">• התסמונת מתרחשת בעת חזרת </w:t>
-      </w:r>
-      <w:proofErr w:type="spellStart"/>
-      <w:r>
-        <w:rPr>
-          <w:rFonts w:ascii="David" w:hAnsi="David" w:cs="David"/>
-          <w:sz w:val="28"/>
-          <w:szCs w:val="28"/>
-        </w:rPr>
-        <w:t>הפרפוזיה</w:t>
-      </w:r>
-      <w:proofErr w:type="spellEnd"/>
-      <w:r>
-        <w:rPr>
-          <w:rFonts w:ascii="David" w:hAnsi="David" w:cs="David"/>
-          <w:sz w:val="28"/>
-          <w:szCs w:val="28"/>
-        </w:rPr>
-        <w:t xml:space="preserve"> לרקמה (שחרור המשקל)</w:t>
+    </w:p>
+    <w:p>
+      <w:pPr>
+        <w:rPr>
+          <w:rFonts w:ascii="David" w:hAnsi="David" w:cs="David"/>
+          <w:sz w:val="28"/>
+          <w:szCs w:val="28"/>
+        </w:rPr>
+      </w:pPr>
+      <w:r>
+        <w:rPr>
+          <w:rFonts w:ascii="David" w:hAnsi="David" w:cs="David"/>
+          <w:sz w:val="28"/>
+          <w:szCs w:val="28"/>
+        </w:rPr>
+        <w:t>• התסמונת מתרחשת בעת חזרת הפרפוזיה לרקמה (שחרור המשקל)</w:t>
       </w:r>
     </w:p>
     <w:p>
@@ -5396,25 +4708,7 @@
           <w:sz w:val="28"/>
           <w:szCs w:val="28"/>
         </w:rPr>
-        <w:t xml:space="preserve">• </w:t>
-      </w:r>
-      <w:proofErr w:type="spellStart"/>
-      <w:r>
-        <w:rPr>
-          <w:rFonts w:ascii="David" w:hAnsi="David" w:cs="David"/>
-          <w:sz w:val="28"/>
-          <w:szCs w:val="28"/>
-        </w:rPr>
-        <w:t>היפוולמיה</w:t>
-      </w:r>
-      <w:proofErr w:type="spellEnd"/>
-      <w:r>
-        <w:rPr>
-          <w:rFonts w:ascii="David" w:hAnsi="David" w:cs="David"/>
-          <w:sz w:val="28"/>
-          <w:szCs w:val="28"/>
-        </w:rPr>
-        <w:t>:</w:t>
+        <w:t>• היפוולמיה:</w:t>
       </w:r>
     </w:p>
     <w:p>
@@ -5465,18 +4759,8 @@
           <w:sz w:val="28"/>
           <w:szCs w:val="28"/>
         </w:rPr>
-        <w:t xml:space="preserve">• שוק </w:t>
-      </w:r>
-      <w:proofErr w:type="spellStart"/>
-      <w:r>
-        <w:rPr>
-          <w:rFonts w:ascii="David" w:hAnsi="David" w:cs="David"/>
-          <w:sz w:val="28"/>
-          <w:szCs w:val="28"/>
-        </w:rPr>
-        <w:t>המורגי</w:t>
-      </w:r>
-      <w:proofErr w:type="spellEnd"/>
+        <w:t>• שוק המורגי</w:t>
+      </w:r>
     </w:p>
     <w:p>
       <w:pPr>
@@ -5535,25 +4819,7 @@
           <w:sz w:val="28"/>
           <w:szCs w:val="28"/>
         </w:rPr>
-        <w:t xml:space="preserve">• </w:t>
-      </w:r>
-      <w:proofErr w:type="spellStart"/>
-      <w:r>
-        <w:rPr>
-          <w:rFonts w:ascii="David" w:hAnsi="David" w:cs="David"/>
-          <w:sz w:val="28"/>
-          <w:szCs w:val="28"/>
-        </w:rPr>
-        <w:t>היפרקלמיה</w:t>
-      </w:r>
-      <w:proofErr w:type="spellEnd"/>
-      <w:r>
-        <w:rPr>
-          <w:rFonts w:ascii="David" w:hAnsi="David" w:cs="David"/>
-          <w:sz w:val="28"/>
-          <w:szCs w:val="28"/>
-        </w:rPr>
-        <w:t xml:space="preserve"> והפרעות קצב</w:t>
+        <w:t>• היפרקלמיה והפרעות קצב</w:t>
       </w:r>
     </w:p>
     <w:p>
@@ -5604,18 +4870,8 @@
           <w:sz w:val="28"/>
           <w:szCs w:val="28"/>
         </w:rPr>
-        <w:t xml:space="preserve">• הלם </w:t>
-      </w:r>
-      <w:proofErr w:type="spellStart"/>
-      <w:r>
-        <w:rPr>
-          <w:rFonts w:ascii="David" w:hAnsi="David" w:cs="David"/>
-          <w:sz w:val="28"/>
-          <w:szCs w:val="28"/>
-        </w:rPr>
-        <w:t>היפוולמי</w:t>
-      </w:r>
-      <w:proofErr w:type="spellEnd"/>
+        <w:t>• הלם היפוולמי</w:t>
+      </w:r>
     </w:p>
     <w:p>
       <w:pPr>
@@ -5725,25 +4981,7 @@
           <w:sz w:val="28"/>
           <w:szCs w:val="28"/>
         </w:rPr>
-        <w:t xml:space="preserve">• </w:t>
-      </w:r>
-      <w:proofErr w:type="spellStart"/>
-      <w:r>
-        <w:rPr>
-          <w:rFonts w:ascii="David" w:hAnsi="David" w:cs="David"/>
-          <w:sz w:val="28"/>
-          <w:szCs w:val="28"/>
-        </w:rPr>
-        <w:t>סליין</w:t>
-      </w:r>
-      <w:proofErr w:type="spellEnd"/>
-      <w:r>
-        <w:rPr>
-          <w:rFonts w:ascii="David" w:hAnsi="David" w:cs="David"/>
-          <w:sz w:val="28"/>
-          <w:szCs w:val="28"/>
-        </w:rPr>
-        <w:t xml:space="preserve"> (לא הרטמן!)</w:t>
+        <w:t>• סליין (לא הרטמן!)</w:t>
       </w:r>
     </w:p>
     <w:p>
@@ -5777,52 +5015,24 @@
           <w:sz w:val="28"/>
           <w:szCs w:val="28"/>
         </w:rPr>
-        <w:t xml:space="preserve">• לחפש עדות </w:t>
-      </w:r>
-      <w:proofErr w:type="spellStart"/>
-      <w:r>
-        <w:rPr>
-          <w:rFonts w:ascii="David" w:hAnsi="David" w:cs="David"/>
-          <w:sz w:val="28"/>
-          <w:szCs w:val="28"/>
-        </w:rPr>
-        <w:t>להיפרקלמיה</w:t>
-      </w:r>
-      <w:proofErr w:type="spellEnd"/>
-    </w:p>
-    <w:p>
-      <w:pPr>
-        <w:rPr>
-          <w:rFonts w:ascii="David" w:hAnsi="David" w:cs="David"/>
-          <w:sz w:val="28"/>
-          <w:szCs w:val="28"/>
-        </w:rPr>
-      </w:pPr>
-      <w:r>
-        <w:rPr>
-          <w:rFonts w:ascii="David" w:hAnsi="David" w:cs="David"/>
-          <w:sz w:val="28"/>
-          <w:szCs w:val="28"/>
-        </w:rPr>
-        <w:t xml:space="preserve">• </w:t>
-      </w:r>
-      <w:proofErr w:type="spellStart"/>
-      <w:r>
-        <w:rPr>
-          <w:rFonts w:ascii="David" w:hAnsi="David" w:cs="David"/>
-          <w:sz w:val="28"/>
-          <w:szCs w:val="28"/>
-        </w:rPr>
-        <w:t>לנטר</w:t>
-      </w:r>
-      <w:proofErr w:type="spellEnd"/>
-      <w:r>
-        <w:rPr>
-          <w:rFonts w:ascii="David" w:hAnsi="David" w:cs="David"/>
-          <w:sz w:val="28"/>
-          <w:szCs w:val="28"/>
-        </w:rPr>
-        <w:t xml:space="preserve"> ולטפל בהפרעות קצב</w:t>
+        <w:t>• לחפש עדות להיפרקלמיה</w:t>
+      </w:r>
+    </w:p>
+    <w:p>
+      <w:pPr>
+        <w:rPr>
+          <w:rFonts w:ascii="David" w:hAnsi="David" w:cs="David"/>
+          <w:sz w:val="28"/>
+          <w:szCs w:val="28"/>
+        </w:rPr>
+      </w:pPr>
+      <w:r>
+        <w:rPr>
+          <w:rFonts w:ascii="David" w:hAnsi="David" w:cs="David"/>
+          <w:sz w:val="28"/>
+          <w:szCs w:val="28"/>
+        </w:rPr>
+        <w:t>• לנטר ולטפל בהפרעות קצב</w:t>
       </w:r>
     </w:p>
     <w:p>
@@ -5927,126 +5137,279 @@
           <w:szCs w:val="28"/>
         </w:rPr>
       </w:pPr>
-      <w:proofErr w:type="spellStart"/>
       <w:r>
         <w:rPr>
           <w:rFonts w:ascii="David" w:hAnsi="David" w:cs="David" w:hint="cs"/>
           <w:sz w:val="28"/>
           <w:szCs w:val="28"/>
         </w:rPr>
-        <w:t>היפרקלמיה</w:t>
-      </w:r>
-      <w:proofErr w:type="spellEnd"/>
+        <w:t>היפרקלמיה באק"ג</w:t>
+      </w:r>
+    </w:p>
+    <w:p>
+      <w:pPr>
+        <w:rPr>
+          <w:rFonts w:ascii="David" w:hAnsi="David" w:cs="David"/>
+          <w:sz w:val="28"/>
+          <w:szCs w:val="28"/>
+        </w:rPr>
+      </w:pPr>
+      <w:r>
+        <w:rPr>
+          <w:rFonts w:ascii="David" w:hAnsi="David" w:cs="David"/>
+          <w:sz w:val="28"/>
+          <w:szCs w:val="28"/>
+        </w:rPr>
+        <w:t>סימני היפרקלמיה באק"ג:</w:t>
+      </w:r>
+    </w:p>
+    <w:p>
+      <w:pPr>
+        <w:rPr>
+          <w:rFonts w:ascii="David" w:hAnsi="David" w:cs="David"/>
+          <w:sz w:val="28"/>
+          <w:szCs w:val="28"/>
+        </w:rPr>
+      </w:pPr>
+      <w:r>
+        <w:rPr>
+          <w:rFonts w:ascii="David" w:hAnsi="David" w:cs="David"/>
+          <w:sz w:val="28"/>
+          <w:szCs w:val="28"/>
+        </w:rPr>
+        <w:t>• חידוד גלי T באק"ג</w:t>
+      </w:r>
+    </w:p>
+    <w:p>
+      <w:pPr>
+        <w:rPr>
+          <w:rFonts w:ascii="David" w:hAnsi="David" w:cs="David"/>
+          <w:sz w:val="28"/>
+          <w:szCs w:val="28"/>
+        </w:rPr>
+      </w:pPr>
+      <w:r>
+        <w:rPr>
+          <w:rFonts w:ascii="David" w:hAnsi="David" w:cs="David"/>
+          <w:sz w:val="28"/>
+          <w:szCs w:val="28"/>
+        </w:rPr>
+        <w:t>• הרחבת קומפלקס QRS</w:t>
+      </w:r>
+    </w:p>
+    <w:p>
+      <w:pPr>
+        <w:rPr>
+          <w:rFonts w:ascii="David" w:hAnsi="David" w:cs="David"/>
+          <w:sz w:val="28"/>
+          <w:szCs w:val="28"/>
+        </w:rPr>
+      </w:pPr>
+      <w:r>
+        <w:rPr>
+          <w:rFonts w:ascii="David" w:hAnsi="David" w:cs="David"/>
+          <w:sz w:val="28"/>
+          <w:szCs w:val="28"/>
+        </w:rPr>
+        <w:t>• הרחבת מקטע PR</w:t>
+      </w:r>
+    </w:p>
+    <w:p>
+      <w:pPr>
+        <w:rPr>
+          <w:rFonts w:ascii="David" w:hAnsi="David" w:cs="David"/>
+          <w:sz w:val="28"/>
+          <w:szCs w:val="28"/>
+        </w:rPr>
+      </w:pPr>
+      <w:r>
+        <w:rPr>
+          <w:rFonts w:ascii="David" w:hAnsi="David" w:cs="David"/>
+          <w:sz w:val="28"/>
+          <w:szCs w:val="28"/>
+        </w:rPr>
+        <w:t>• היעלמות גלי P</w:t>
+      </w:r>
+    </w:p>
+    <w:p>
+      <w:pPr>
+        <w:rPr>
+          <w:rFonts w:ascii="David" w:hAnsi="David" w:cs="David"/>
+          <w:sz w:val="28"/>
+          <w:szCs w:val="28"/>
+        </w:rPr>
+      </w:pPr>
+    </w:p>
+    <w:p>
+      <w:pPr>
+        <w:rPr>
+          <w:rFonts w:ascii="David" w:hAnsi="David" w:cs="David"/>
+          <w:sz w:val="28"/>
+          <w:szCs w:val="28"/>
+        </w:rPr>
+      </w:pPr>
       <w:r>
         <w:rPr>
           <w:rFonts w:ascii="David" w:hAnsi="David" w:cs="David" w:hint="cs"/>
           <w:sz w:val="28"/>
           <w:szCs w:val="28"/>
         </w:rPr>
-        <w:t xml:space="preserve"> באק"ג</w:t>
-      </w:r>
-    </w:p>
-    <w:p>
-      <w:pPr>
-        <w:rPr>
-          <w:rFonts w:ascii="David" w:hAnsi="David" w:cs="David"/>
-          <w:sz w:val="28"/>
-          <w:szCs w:val="28"/>
-        </w:rPr>
-      </w:pPr>
-      <w:r>
-        <w:rPr>
-          <w:rFonts w:ascii="David" w:hAnsi="David" w:cs="David"/>
-          <w:sz w:val="28"/>
-          <w:szCs w:val="28"/>
-        </w:rPr>
-        <w:t xml:space="preserve">סימני </w:t>
-      </w:r>
-      <w:proofErr w:type="spellStart"/>
-      <w:r>
-        <w:rPr>
-          <w:rFonts w:ascii="David" w:hAnsi="David" w:cs="David"/>
-          <w:sz w:val="28"/>
-          <w:szCs w:val="28"/>
-        </w:rPr>
-        <w:t>היפרקלמיה</w:t>
-      </w:r>
-      <w:proofErr w:type="spellEnd"/>
-      <w:r>
-        <w:rPr>
-          <w:rFonts w:ascii="David" w:hAnsi="David" w:cs="David"/>
-          <w:sz w:val="28"/>
-          <w:szCs w:val="28"/>
-        </w:rPr>
-        <w:t xml:space="preserve"> באק"ג:</w:t>
-      </w:r>
-    </w:p>
-    <w:p>
-      <w:pPr>
-        <w:rPr>
-          <w:rFonts w:ascii="David" w:hAnsi="David" w:cs="David"/>
-          <w:sz w:val="28"/>
-          <w:szCs w:val="28"/>
-        </w:rPr>
-      </w:pPr>
-      <w:r>
-        <w:rPr>
-          <w:rFonts w:ascii="David" w:hAnsi="David" w:cs="David"/>
-          <w:sz w:val="28"/>
-          <w:szCs w:val="28"/>
-        </w:rPr>
-        <w:t>• חידוד גלי T באק"ג</w:t>
-      </w:r>
-    </w:p>
-    <w:p>
-      <w:pPr>
-        <w:rPr>
-          <w:rFonts w:ascii="David" w:hAnsi="David" w:cs="David"/>
-          <w:sz w:val="28"/>
-          <w:szCs w:val="28"/>
-        </w:rPr>
-      </w:pPr>
-      <w:r>
-        <w:rPr>
-          <w:rFonts w:ascii="David" w:hAnsi="David" w:cs="David"/>
-          <w:sz w:val="28"/>
-          <w:szCs w:val="28"/>
-        </w:rPr>
-        <w:t>• הרחבת קומפלקס QRS</w:t>
-      </w:r>
-    </w:p>
-    <w:p>
-      <w:pPr>
-        <w:rPr>
-          <w:rFonts w:ascii="David" w:hAnsi="David" w:cs="David"/>
-          <w:sz w:val="28"/>
-          <w:szCs w:val="28"/>
-        </w:rPr>
-      </w:pPr>
-      <w:r>
-        <w:rPr>
-          <w:rFonts w:ascii="David" w:hAnsi="David" w:cs="David"/>
-          <w:sz w:val="28"/>
-          <w:szCs w:val="28"/>
-        </w:rPr>
-        <w:t>• הרחבת מקטע PR</w:t>
-      </w:r>
-    </w:p>
-    <w:p>
-      <w:pPr>
-        <w:rPr>
-          <w:rFonts w:ascii="David" w:hAnsi="David" w:cs="David"/>
-          <w:sz w:val="28"/>
-          <w:szCs w:val="28"/>
-        </w:rPr>
-      </w:pPr>
-      <w:r>
-        <w:rPr>
-          <w:rFonts w:ascii="David" w:hAnsi="David" w:cs="David"/>
-          <w:sz w:val="28"/>
-          <w:szCs w:val="28"/>
-        </w:rPr>
-        <w:t>• היעלמות גלי P</w:t>
+        <w:t>טיפול בחשד להיפרקלמיה</w:t>
+      </w:r>
+    </w:p>
+    <w:p>
+      <w:pPr>
+        <w:rPr>
+          <w:rFonts w:ascii="David" w:hAnsi="David" w:cs="David"/>
+          <w:sz w:val="28"/>
+          <w:szCs w:val="28"/>
+          <w:rtl w:val="0"/>
+        </w:rPr>
+      </w:pPr>
+      <w:r>
+        <w:rPr>
+          <w:rFonts w:ascii="David" w:hAnsi="David" w:cs="David"/>
+          <w:sz w:val="28"/>
+          <w:szCs w:val="28"/>
+        </w:rPr>
+        <w:t>הנה הטקסט עם רווחים בין המילים:</w:t>
+      </w:r>
+    </w:p>
+    <w:p>
+      <w:pPr>
+        <w:rPr>
+          <w:rFonts w:ascii="David" w:hAnsi="David" w:cs="David"/>
+          <w:sz w:val="28"/>
+          <w:szCs w:val="28"/>
+        </w:rPr>
+      </w:pPr>
+      <w:r>
+        <w:rPr>
+          <w:rFonts w:ascii="David" w:hAnsi="David" w:cs="David"/>
+          <w:sz w:val="28"/>
+          <w:szCs w:val="28"/>
+        </w:rPr>
+        <w:t>טיפול לפי פרוטוקול והסיבה:</w:t>
+      </w:r>
+    </w:p>
+    <w:p>
+      <w:pPr>
+        <w:rPr>
+          <w:rFonts w:ascii="David" w:hAnsi="David" w:cs="David"/>
+          <w:sz w:val="28"/>
+          <w:szCs w:val="28"/>
+        </w:rPr>
+      </w:pPr>
+      <w:r>
+        <w:rPr>
+          <w:rFonts w:ascii="David" w:hAnsi="David" w:cs="David"/>
+          <w:sz w:val="28"/>
+          <w:szCs w:val="28"/>
+        </w:rPr>
+        <w:t>• קלציום - היפרקלמיה</w:t>
+      </w:r>
+    </w:p>
+    <w:p>
+      <w:pPr>
+        <w:rPr>
+          <w:rFonts w:ascii="David" w:hAnsi="David" w:cs="David"/>
+          <w:sz w:val="28"/>
+          <w:szCs w:val="28"/>
+        </w:rPr>
+      </w:pPr>
+      <w:r>
+        <w:rPr>
+          <w:rFonts w:ascii="David" w:hAnsi="David" w:cs="David"/>
+          <w:sz w:val="28"/>
+          <w:szCs w:val="28"/>
+        </w:rPr>
+        <w:t>• ביקרבונט - היפרקלמיה / עדות לפגיעה כלייתית</w:t>
+      </w:r>
+    </w:p>
+    <w:p>
+      <w:pPr>
+        <w:rPr>
+          <w:rFonts w:ascii="David" w:hAnsi="David" w:cs="David"/>
+          <w:sz w:val="28"/>
+          <w:szCs w:val="28"/>
+        </w:rPr>
+      </w:pPr>
+      <w:r>
+        <w:rPr>
+          <w:rFonts w:ascii="David" w:hAnsi="David" w:cs="David"/>
+          <w:sz w:val="28"/>
+          <w:szCs w:val="28"/>
+        </w:rPr>
+        <w:t>• פוסיד - היפרקלמיה / עדות לגודש ריאתי</w:t>
+      </w:r>
+    </w:p>
+    <w:p>
+      <w:pPr>
+        <w:rPr>
+          <w:rFonts w:ascii="David" w:hAnsi="David" w:cs="David"/>
+          <w:sz w:val="28"/>
+          <w:szCs w:val="28"/>
+        </w:rPr>
+      </w:pPr>
+      <w:r>
+        <w:rPr>
+          <w:rFonts w:ascii="David" w:hAnsi="David" w:cs="David"/>
+          <w:sz w:val="28"/>
+          <w:szCs w:val="28"/>
+        </w:rPr>
+        <w:t>• ונטולין - היפרקלמיה</w:t>
+      </w:r>
+    </w:p>
+    <w:p>
+      <w:pPr>
+        <w:rPr>
+          <w:rFonts w:ascii="David" w:hAnsi="David" w:cs="David"/>
+          <w:sz w:val="28"/>
+          <w:szCs w:val="28"/>
+        </w:rPr>
+      </w:pPr>
+      <w:r>
+        <w:rPr>
+          <w:rFonts w:ascii="David" w:hAnsi="David" w:cs="David"/>
+          <w:sz w:val="28"/>
+          <w:szCs w:val="28"/>
+        </w:rPr>
+        <w:lastRenderedPageBreak/>
+        <w:t>• גלוקוז - היפרקלמיה</w:t>
+      </w:r>
+    </w:p>
+    <w:p>
+      <w:pPr>
+        <w:rPr>
+          <w:rFonts w:ascii="David" w:hAnsi="David" w:cs="David"/>
+          <w:sz w:val="28"/>
+          <w:szCs w:val="28"/>
+        </w:rPr>
+      </w:pPr>
+      <w:r>
+        <w:rPr>
+          <w:rFonts w:ascii="David" w:hAnsi="David" w:cs="David"/>
+          <w:sz w:val="28"/>
+          <w:szCs w:val="28"/>
+        </w:rPr>
+        <w:t>• נוזלים - היפרקלמיה / אי-ספיקה כלייתית / "מניעתי" טרם שחרור האיבר</w:t>
+      </w:r>
+    </w:p>
+    <w:p>
+      <w:pPr>
+        <w:rPr>
+          <w:rFonts w:ascii="David" w:hAnsi="David" w:cs="David"/>
+          <w:sz w:val="28"/>
+          <w:szCs w:val="28"/>
+        </w:rPr>
+      </w:pPr>
+      <w:r>
+        <w:rPr>
+          <w:rFonts w:ascii="David" w:hAnsi="David" w:cs="David"/>
+          <w:sz w:val="28"/>
+          <w:szCs w:val="28"/>
+        </w:rPr>
+        <w:t>מלבד נוזלים – כל התרופות הנ"ל מחייבות אישור מוקד רפואי</w:t>
       </w:r>
     </w:p>
     <w:p>
@@ -6072,18 +5435,231 @@
           <w:sz w:val="28"/>
           <w:szCs w:val="28"/>
         </w:rPr>
-        <w:t xml:space="preserve">טיפול בחשד </w:t>
-      </w:r>
-      <w:proofErr w:type="spellStart"/>
+        <w:t>טיפול תרופתי קלציום</w:t>
+      </w:r>
+    </w:p>
+    <w:p>
+      <w:pPr>
+        <w:rPr>
+          <w:rFonts w:ascii="David" w:hAnsi="David" w:cs="David"/>
+          <w:sz w:val="28"/>
+          <w:szCs w:val="28"/>
+          <w:rtl w:val="0"/>
+        </w:rPr>
+      </w:pPr>
+      <w:r>
+        <w:rPr>
+          <w:rFonts w:ascii="David" w:hAnsi="David" w:cs="David"/>
+          <w:sz w:val="28"/>
+          <w:szCs w:val="28"/>
+        </w:rPr>
+        <w:t>הנה הטקסט עם רווחים בין המילים:</w:t>
+      </w:r>
+    </w:p>
+    <w:p>
+      <w:pPr>
+        <w:rPr>
+          <w:rFonts w:ascii="David" w:hAnsi="David" w:cs="David"/>
+          <w:sz w:val="28"/>
+          <w:szCs w:val="28"/>
+        </w:rPr>
+      </w:pPr>
+      <w:r>
+        <w:rPr>
+          <w:rFonts w:ascii="David" w:hAnsi="David" w:cs="David"/>
+          <w:sz w:val="28"/>
+          <w:szCs w:val="28"/>
+        </w:rPr>
+        <w:t>קלציום גלוקונט - לפצועים עם עדות להיפרקלמיה באק"ג</w:t>
+      </w:r>
+    </w:p>
+    <w:p>
+      <w:pPr>
+        <w:rPr>
+          <w:rFonts w:ascii="David" w:hAnsi="David" w:cs="David"/>
+          <w:sz w:val="28"/>
+          <w:szCs w:val="28"/>
+        </w:rPr>
+      </w:pPr>
+      <w:r>
+        <w:rPr>
+          <w:rFonts w:ascii="David" w:hAnsi="David" w:cs="David"/>
+          <w:sz w:val="28"/>
+          <w:szCs w:val="28"/>
+        </w:rPr>
+        <w:t>• סידן הינו אלקטרוליט חשוב בתפקוד המיוציטות איהה הולכה</w:t>
+      </w:r>
+    </w:p>
+    <w:p>
+      <w:pPr>
+        <w:rPr>
+          <w:rFonts w:ascii="David" w:hAnsi="David" w:cs="David"/>
+          <w:sz w:val="28"/>
+          <w:szCs w:val="28"/>
+        </w:rPr>
+      </w:pPr>
+      <w:r>
+        <w:rPr>
+          <w:rFonts w:ascii="David" w:hAnsi="David" w:cs="David"/>
+          <w:sz w:val="28"/>
+          <w:szCs w:val="28"/>
+        </w:rPr>
+        <w:t>• אשלגן מפריע לתפקוד זה</w:t>
+      </w:r>
+    </w:p>
+    <w:p>
+      <w:pPr>
+        <w:rPr>
+          <w:rFonts w:ascii="David" w:hAnsi="David" w:cs="David"/>
+          <w:sz w:val="28"/>
+          <w:szCs w:val="28"/>
+        </w:rPr>
+      </w:pPr>
+      <w:r>
+        <w:rPr>
+          <w:rFonts w:ascii="David" w:hAnsi="David" w:cs="David"/>
+          <w:sz w:val="28"/>
+          <w:szCs w:val="28"/>
+        </w:rPr>
+        <w:t>• לסידן יש השפעה מוכחת במניעת הפרעות קצב הנובעות מהיפרקלמיה (אנטגוניסט לאשלגן)</w:t>
+      </w:r>
+    </w:p>
+    <w:p>
+      <w:pPr>
+        <w:rPr>
+          <w:rFonts w:ascii="David" w:hAnsi="David" w:cs="David"/>
+          <w:sz w:val="28"/>
+          <w:szCs w:val="28"/>
+        </w:rPr>
+      </w:pPr>
+      <w:r>
+        <w:rPr>
+          <w:rFonts w:ascii="David" w:hAnsi="David" w:cs="David"/>
+          <w:sz w:val="28"/>
+          <w:szCs w:val="28"/>
+        </w:rPr>
+        <w:t>מנה: 1 גרם בהזלפה איטית (1-2 דקות)</w:t>
+      </w:r>
+    </w:p>
+    <w:p>
+      <w:pPr>
+        <w:rPr>
+          <w:rFonts w:ascii="David" w:hAnsi="David" w:cs="David"/>
+          <w:sz w:val="28"/>
+          <w:szCs w:val="28"/>
+        </w:rPr>
+      </w:pPr>
+      <w:r>
+        <w:rPr>
+          <w:rFonts w:ascii="David" w:hAnsi="David" w:cs="David"/>
+          <w:sz w:val="28"/>
+          <w:szCs w:val="28"/>
+        </w:rPr>
+        <w:t>• אמפולה מגיעה 1 גרם / 10 מ"ל</w:t>
+      </w:r>
+    </w:p>
+    <w:p>
+      <w:pPr>
+        <w:rPr>
+          <w:rFonts w:ascii="David" w:hAnsi="David" w:cs="David"/>
+          <w:sz w:val="28"/>
+          <w:szCs w:val="28"/>
+        </w:rPr>
+      </w:pPr>
+      <w:r>
+        <w:rPr>
+          <w:rFonts w:ascii="David" w:hAnsi="David" w:cs="David"/>
+          <w:sz w:val="28"/>
+          <w:szCs w:val="28"/>
+        </w:rPr>
+        <w:t>מטרת הטיפול</w:t>
+      </w:r>
+    </w:p>
+    <w:p>
+      <w:pPr>
+        <w:rPr>
+          <w:rFonts w:ascii="David" w:hAnsi="David" w:cs="David"/>
+          <w:sz w:val="28"/>
+          <w:szCs w:val="28"/>
+        </w:rPr>
+      </w:pPr>
+      <w:r>
+        <w:rPr>
+          <w:rFonts w:ascii="David" w:hAnsi="David" w:cs="David"/>
+          <w:sz w:val="28"/>
+          <w:szCs w:val="28"/>
+        </w:rPr>
+        <w:t>• התמודדות עם היפרקלמיה</w:t>
+      </w:r>
+    </w:p>
+    <w:p>
+      <w:pPr>
+        <w:rPr>
+          <w:rFonts w:ascii="David" w:hAnsi="David" w:cs="David"/>
+          <w:sz w:val="28"/>
+          <w:szCs w:val="28"/>
+        </w:rPr>
+      </w:pPr>
+      <w:r>
+        <w:rPr>
+          <w:rFonts w:ascii="David" w:hAnsi="David" w:cs="David"/>
+          <w:sz w:val="28"/>
+          <w:szCs w:val="28"/>
+        </w:rPr>
+        <w:t>• מסייע בהכנסת האשלגן מהדם אל התאים</w:t>
+      </w:r>
+    </w:p>
+    <w:p>
+      <w:pPr>
+        <w:rPr>
+          <w:rFonts w:ascii="David" w:hAnsi="David" w:cs="David"/>
+          <w:sz w:val="28"/>
+          <w:szCs w:val="28"/>
+        </w:rPr>
+      </w:pPr>
+      <w:r>
+        <w:rPr>
+          <w:rFonts w:ascii="David" w:hAnsi="David" w:cs="David"/>
+          <w:sz w:val="28"/>
+          <w:szCs w:val="28"/>
+        </w:rPr>
+        <w:t>• עוזר במניעת הפרעות קצב מסכנות חיים (מגן על שריר הלב)</w:t>
+      </w:r>
+    </w:p>
+    <w:p>
+      <w:pPr>
+        <w:rPr>
+          <w:rFonts w:ascii="David" w:hAnsi="David" w:cs="David"/>
+          <w:sz w:val="28"/>
+          <w:szCs w:val="28"/>
+        </w:rPr>
+      </w:pPr>
+    </w:p>
+    <w:p>
+      <w:pPr>
+        <w:rPr>
+          <w:rFonts w:ascii="David" w:hAnsi="David" w:cs="David"/>
+          <w:sz w:val="28"/>
+          <w:szCs w:val="28"/>
+        </w:rPr>
+      </w:pPr>
+    </w:p>
+    <w:p>
+      <w:pPr>
+        <w:rPr>
+          <w:rFonts w:ascii="David" w:hAnsi="David" w:cs="David"/>
+          <w:sz w:val="28"/>
+          <w:szCs w:val="28"/>
+        </w:rPr>
+      </w:pPr>
       <w:r>
         <w:rPr>
           <w:rFonts w:ascii="David" w:hAnsi="David" w:cs="David" w:hint="cs"/>
           <w:sz w:val="28"/>
           <w:szCs w:val="28"/>
         </w:rPr>
-        <w:t>להיפרקלמיה</w:t>
-      </w:r>
-      <w:proofErr w:type="spellEnd"/>
+        <w:t>טיפול תרופתי סודיום בי קרבונט</w:t>
+      </w:r>
     </w:p>
     <w:p>
       <w:pPr>
@@ -6117,247 +5693,109 @@
           <w:sz w:val="28"/>
           <w:szCs w:val="28"/>
         </w:rPr>
-        <w:t>טיפול לפי פרוטוקול והסיבה:</w:t>
-      </w:r>
-    </w:p>
-    <w:p>
-      <w:pPr>
-        <w:rPr>
-          <w:rFonts w:ascii="David" w:hAnsi="David" w:cs="David"/>
-          <w:sz w:val="28"/>
-          <w:szCs w:val="28"/>
-        </w:rPr>
-      </w:pPr>
-      <w:r>
-        <w:rPr>
-          <w:rFonts w:ascii="David" w:hAnsi="David" w:cs="David"/>
-          <w:sz w:val="28"/>
-          <w:szCs w:val="28"/>
-        </w:rPr>
-        <w:t xml:space="preserve">• קלציום - </w:t>
-      </w:r>
-      <w:proofErr w:type="spellStart"/>
-      <w:r>
-        <w:rPr>
-          <w:rFonts w:ascii="David" w:hAnsi="David" w:cs="David"/>
-          <w:sz w:val="28"/>
-          <w:szCs w:val="28"/>
-        </w:rPr>
-        <w:t>היפרקלמיה</w:t>
-      </w:r>
-      <w:proofErr w:type="spellEnd"/>
-    </w:p>
-    <w:p>
-      <w:pPr>
-        <w:rPr>
-          <w:rFonts w:ascii="David" w:hAnsi="David" w:cs="David"/>
-          <w:sz w:val="28"/>
-          <w:szCs w:val="28"/>
-        </w:rPr>
-      </w:pPr>
-      <w:r>
-        <w:rPr>
-          <w:rFonts w:ascii="David" w:hAnsi="David" w:cs="David"/>
-          <w:sz w:val="28"/>
-          <w:szCs w:val="28"/>
-        </w:rPr>
-        <w:t xml:space="preserve">• ביקרבונט - </w:t>
-      </w:r>
-      <w:proofErr w:type="spellStart"/>
-      <w:r>
-        <w:rPr>
-          <w:rFonts w:ascii="David" w:hAnsi="David" w:cs="David"/>
-          <w:sz w:val="28"/>
-          <w:szCs w:val="28"/>
-        </w:rPr>
-        <w:t>היפרקלמיה</w:t>
-      </w:r>
-      <w:proofErr w:type="spellEnd"/>
-      <w:r>
-        <w:rPr>
-          <w:rFonts w:ascii="David" w:hAnsi="David" w:cs="David"/>
-          <w:sz w:val="28"/>
-          <w:szCs w:val="28"/>
-        </w:rPr>
-        <w:t xml:space="preserve"> / עדות לפגיעה כלייתית</w:t>
-      </w:r>
-    </w:p>
-    <w:p>
-      <w:pPr>
-        <w:rPr>
-          <w:rFonts w:ascii="David" w:hAnsi="David" w:cs="David"/>
-          <w:sz w:val="28"/>
-          <w:szCs w:val="28"/>
-        </w:rPr>
-      </w:pPr>
-      <w:r>
-        <w:rPr>
-          <w:rFonts w:ascii="David" w:hAnsi="David" w:cs="David"/>
-          <w:sz w:val="28"/>
-          <w:szCs w:val="28"/>
-        </w:rPr>
-        <w:t xml:space="preserve">• </w:t>
-      </w:r>
-      <w:proofErr w:type="spellStart"/>
-      <w:r>
-        <w:rPr>
-          <w:rFonts w:ascii="David" w:hAnsi="David" w:cs="David"/>
-          <w:sz w:val="28"/>
-          <w:szCs w:val="28"/>
-        </w:rPr>
-        <w:t>פוסיד</w:t>
-      </w:r>
-      <w:proofErr w:type="spellEnd"/>
-      <w:r>
-        <w:rPr>
-          <w:rFonts w:ascii="David" w:hAnsi="David" w:cs="David"/>
-          <w:sz w:val="28"/>
-          <w:szCs w:val="28"/>
-        </w:rPr>
-        <w:t xml:space="preserve"> - </w:t>
-      </w:r>
-      <w:proofErr w:type="spellStart"/>
-      <w:r>
-        <w:rPr>
-          <w:rFonts w:ascii="David" w:hAnsi="David" w:cs="David"/>
-          <w:sz w:val="28"/>
-          <w:szCs w:val="28"/>
-        </w:rPr>
-        <w:t>היפרקלמיה</w:t>
-      </w:r>
-      <w:proofErr w:type="spellEnd"/>
-      <w:r>
-        <w:rPr>
-          <w:rFonts w:ascii="David" w:hAnsi="David" w:cs="David"/>
-          <w:sz w:val="28"/>
-          <w:szCs w:val="28"/>
-        </w:rPr>
-        <w:t xml:space="preserve"> / עדות לגודש ריאתי</w:t>
-      </w:r>
-    </w:p>
-    <w:p>
-      <w:pPr>
-        <w:rPr>
-          <w:rFonts w:ascii="David" w:hAnsi="David" w:cs="David"/>
-          <w:sz w:val="28"/>
-          <w:szCs w:val="28"/>
-        </w:rPr>
-      </w:pPr>
-      <w:r>
-        <w:rPr>
-          <w:rFonts w:ascii="David" w:hAnsi="David" w:cs="David"/>
-          <w:sz w:val="28"/>
-          <w:szCs w:val="28"/>
-        </w:rPr>
-        <w:lastRenderedPageBreak/>
-        <w:t xml:space="preserve">• </w:t>
-      </w:r>
-      <w:proofErr w:type="spellStart"/>
-      <w:r>
-        <w:rPr>
-          <w:rFonts w:ascii="David" w:hAnsi="David" w:cs="David"/>
-          <w:sz w:val="28"/>
-          <w:szCs w:val="28"/>
-        </w:rPr>
-        <w:t>ונטולין</w:t>
-      </w:r>
-      <w:proofErr w:type="spellEnd"/>
-      <w:r>
-        <w:rPr>
-          <w:rFonts w:ascii="David" w:hAnsi="David" w:cs="David"/>
-          <w:sz w:val="28"/>
-          <w:szCs w:val="28"/>
-        </w:rPr>
-        <w:t xml:space="preserve"> - </w:t>
-      </w:r>
-      <w:proofErr w:type="spellStart"/>
-      <w:r>
-        <w:rPr>
-          <w:rFonts w:ascii="David" w:hAnsi="David" w:cs="David"/>
-          <w:sz w:val="28"/>
-          <w:szCs w:val="28"/>
-        </w:rPr>
-        <w:t>היפרקלמיה</w:t>
-      </w:r>
-      <w:proofErr w:type="spellEnd"/>
-    </w:p>
-    <w:p>
-      <w:pPr>
-        <w:rPr>
-          <w:rFonts w:ascii="David" w:hAnsi="David" w:cs="David"/>
-          <w:sz w:val="28"/>
-          <w:szCs w:val="28"/>
-        </w:rPr>
-      </w:pPr>
-      <w:r>
-        <w:rPr>
-          <w:rFonts w:ascii="David" w:hAnsi="David" w:cs="David"/>
-          <w:sz w:val="28"/>
-          <w:szCs w:val="28"/>
-        </w:rPr>
-        <w:t xml:space="preserve">• גלוקוז - </w:t>
-      </w:r>
-      <w:proofErr w:type="spellStart"/>
-      <w:r>
-        <w:rPr>
-          <w:rFonts w:ascii="David" w:hAnsi="David" w:cs="David"/>
-          <w:sz w:val="28"/>
-          <w:szCs w:val="28"/>
-        </w:rPr>
-        <w:t>היפרקלמיה</w:t>
-      </w:r>
-      <w:proofErr w:type="spellEnd"/>
-    </w:p>
-    <w:p>
-      <w:pPr>
-        <w:rPr>
-          <w:rFonts w:ascii="David" w:hAnsi="David" w:cs="David"/>
-          <w:sz w:val="28"/>
-          <w:szCs w:val="28"/>
-        </w:rPr>
-      </w:pPr>
-      <w:r>
-        <w:rPr>
-          <w:rFonts w:ascii="David" w:hAnsi="David" w:cs="David"/>
-          <w:sz w:val="28"/>
-          <w:szCs w:val="28"/>
-        </w:rPr>
-        <w:t xml:space="preserve">• נוזלים - </w:t>
-      </w:r>
-      <w:proofErr w:type="spellStart"/>
-      <w:r>
-        <w:rPr>
-          <w:rFonts w:ascii="David" w:hAnsi="David" w:cs="David"/>
-          <w:sz w:val="28"/>
-          <w:szCs w:val="28"/>
-        </w:rPr>
-        <w:t>היפרקלמיה</w:t>
-      </w:r>
-      <w:proofErr w:type="spellEnd"/>
-      <w:r>
-        <w:rPr>
-          <w:rFonts w:ascii="David" w:hAnsi="David" w:cs="David"/>
-          <w:sz w:val="28"/>
-          <w:szCs w:val="28"/>
-        </w:rPr>
-        <w:t xml:space="preserve"> / אי-ספיקה כלייתית / "מניעתי" טרם שחרור האיבר</w:t>
-      </w:r>
-    </w:p>
-    <w:p>
-      <w:pPr>
-        <w:rPr>
-          <w:rFonts w:ascii="David" w:hAnsi="David" w:cs="David"/>
-          <w:sz w:val="28"/>
-          <w:szCs w:val="28"/>
-        </w:rPr>
-      </w:pPr>
-      <w:r>
-        <w:rPr>
-          <w:rFonts w:ascii="David" w:hAnsi="David" w:cs="David"/>
-          <w:sz w:val="28"/>
-          <w:szCs w:val="28"/>
-        </w:rPr>
-        <w:t>מלבד נוזלים – כל התרופות הנ"ל מחייבות אישור מוקד רפואי</w:t>
+        <w:t>סודיום ביקרבונט - לפצועים עם עדות לפגיעה כלייתית או סימני היפרקלמיה</w:t>
+      </w:r>
+    </w:p>
+    <w:p>
+      <w:pPr>
+        <w:rPr>
+          <w:rFonts w:ascii="David" w:hAnsi="David" w:cs="David"/>
+          <w:sz w:val="28"/>
+          <w:szCs w:val="28"/>
+        </w:rPr>
+      </w:pPr>
+      <w:r>
+        <w:rPr>
+          <w:rFonts w:ascii="David" w:hAnsi="David" w:cs="David"/>
+          <w:sz w:val="28"/>
+          <w:szCs w:val="28"/>
+        </w:rPr>
+        <w:t>• מחייב ניטור רציף של המטופל</w:t>
+      </w:r>
+    </w:p>
+    <w:p>
+      <w:pPr>
+        <w:rPr>
+          <w:rFonts w:ascii="David" w:hAnsi="David" w:cs="David"/>
+          <w:sz w:val="28"/>
+          <w:szCs w:val="28"/>
+        </w:rPr>
+      </w:pPr>
+      <w:r>
+        <w:rPr>
+          <w:rFonts w:ascii="David" w:hAnsi="David" w:cs="David"/>
+          <w:sz w:val="28"/>
+          <w:szCs w:val="28"/>
+        </w:rPr>
+        <w:t>• נוגד חומצה מערכתי מהיר וחזק</w:t>
+      </w:r>
+    </w:p>
+    <w:p>
+      <w:pPr>
+        <w:rPr>
+          <w:rFonts w:ascii="David" w:hAnsi="David" w:cs="David"/>
+          <w:sz w:val="28"/>
+          <w:szCs w:val="28"/>
+        </w:rPr>
+      </w:pPr>
+      <w:r>
+        <w:rPr>
+          <w:rFonts w:ascii="David" w:hAnsi="David" w:cs="David"/>
+          <w:sz w:val="28"/>
+          <w:szCs w:val="28"/>
+        </w:rPr>
+        <w:t>מטרת הטיפול</w:t>
+      </w:r>
+    </w:p>
+    <w:p>
+      <w:pPr>
+        <w:rPr>
+          <w:rFonts w:ascii="David" w:hAnsi="David" w:cs="David"/>
+          <w:sz w:val="28"/>
+          <w:szCs w:val="28"/>
+        </w:rPr>
+      </w:pPr>
+      <w:r>
+        <w:rPr>
+          <w:rFonts w:ascii="David" w:hAnsi="David" w:cs="David"/>
+          <w:sz w:val="28"/>
+          <w:szCs w:val="28"/>
+        </w:rPr>
+        <w:t>• טיפול בחמצת המטבולית</w:t>
+      </w:r>
+    </w:p>
+    <w:p>
+      <w:pPr>
+        <w:rPr>
+          <w:rFonts w:ascii="David" w:hAnsi="David" w:cs="David"/>
+          <w:sz w:val="28"/>
+          <w:szCs w:val="28"/>
+        </w:rPr>
+      </w:pPr>
+      <w:r>
+        <w:rPr>
+          <w:rFonts w:ascii="David" w:hAnsi="David" w:cs="David"/>
+          <w:sz w:val="28"/>
+          <w:szCs w:val="28"/>
+        </w:rPr>
+        <w:t>• טיפול באי-ספיקת כליות</w:t>
+      </w:r>
+    </w:p>
+    <w:p>
+      <w:pPr>
+        <w:rPr>
+          <w:rFonts w:ascii="David" w:hAnsi="David" w:cs="David"/>
+          <w:sz w:val="28"/>
+          <w:szCs w:val="28"/>
+        </w:rPr>
+      </w:pPr>
+      <w:r>
+        <w:rPr>
+          <w:rFonts w:ascii="David" w:hAnsi="David" w:cs="David"/>
+          <w:sz w:val="28"/>
+          <w:szCs w:val="28"/>
+        </w:rPr>
+        <w:t>• טיפול בהיפרקלמיה</w:t>
       </w:r>
     </w:p>
     <w:p>
@@ -6383,529 +5821,13 @@
           <w:sz w:val="28"/>
           <w:szCs w:val="28"/>
         </w:rPr>
-        <w:t>טיפול תרופתי קלציום</w:t>
-      </w:r>
-    </w:p>
-    <w:p>
-      <w:pPr>
-        <w:rPr>
-          <w:rFonts w:ascii="David" w:hAnsi="David" w:cs="David"/>
-          <w:sz w:val="28"/>
-          <w:szCs w:val="28"/>
-          <w:rtl w:val="0"/>
-        </w:rPr>
-      </w:pPr>
-      <w:r>
-        <w:rPr>
-          <w:rFonts w:ascii="David" w:hAnsi="David" w:cs="David"/>
-          <w:sz w:val="28"/>
-          <w:szCs w:val="28"/>
-        </w:rPr>
-        <w:t>הנה הטקסט עם רווחים בין המילים:</w:t>
-      </w:r>
-    </w:p>
-    <w:p>
-      <w:pPr>
-        <w:rPr>
-          <w:rFonts w:ascii="David" w:hAnsi="David" w:cs="David"/>
-          <w:sz w:val="28"/>
-          <w:szCs w:val="28"/>
-        </w:rPr>
-      </w:pPr>
-      <w:r>
-        <w:rPr>
-          <w:rFonts w:ascii="David" w:hAnsi="David" w:cs="David"/>
-          <w:sz w:val="28"/>
-          <w:szCs w:val="28"/>
-        </w:rPr>
-        <w:t xml:space="preserve">קלציום </w:t>
-      </w:r>
-      <w:proofErr w:type="spellStart"/>
-      <w:r>
-        <w:rPr>
-          <w:rFonts w:ascii="David" w:hAnsi="David" w:cs="David"/>
-          <w:sz w:val="28"/>
-          <w:szCs w:val="28"/>
-        </w:rPr>
-        <w:t>גלוקונט</w:t>
-      </w:r>
-      <w:proofErr w:type="spellEnd"/>
-      <w:r>
-        <w:rPr>
-          <w:rFonts w:ascii="David" w:hAnsi="David" w:cs="David"/>
-          <w:sz w:val="28"/>
-          <w:szCs w:val="28"/>
-        </w:rPr>
-        <w:t xml:space="preserve"> - לפצועים עם עדות </w:t>
-      </w:r>
-      <w:proofErr w:type="spellStart"/>
-      <w:r>
-        <w:rPr>
-          <w:rFonts w:ascii="David" w:hAnsi="David" w:cs="David"/>
-          <w:sz w:val="28"/>
-          <w:szCs w:val="28"/>
-        </w:rPr>
-        <w:t>להיפרקלמיה</w:t>
-      </w:r>
-      <w:proofErr w:type="spellEnd"/>
-      <w:r>
-        <w:rPr>
-          <w:rFonts w:ascii="David" w:hAnsi="David" w:cs="David"/>
-          <w:sz w:val="28"/>
-          <w:szCs w:val="28"/>
-        </w:rPr>
-        <w:t xml:space="preserve"> באק"ג</w:t>
-      </w:r>
-    </w:p>
-    <w:p>
-      <w:pPr>
-        <w:rPr>
-          <w:rFonts w:ascii="David" w:hAnsi="David" w:cs="David"/>
-          <w:sz w:val="28"/>
-          <w:szCs w:val="28"/>
-        </w:rPr>
-      </w:pPr>
-      <w:r>
-        <w:rPr>
-          <w:rFonts w:ascii="David" w:hAnsi="David" w:cs="David"/>
-          <w:sz w:val="28"/>
-          <w:szCs w:val="28"/>
-        </w:rPr>
-        <w:t xml:space="preserve">• סידן הינו אלקטרוליט חשוב בתפקוד </w:t>
-      </w:r>
-      <w:proofErr w:type="spellStart"/>
-      <w:r>
-        <w:rPr>
-          <w:rFonts w:ascii="David" w:hAnsi="David" w:cs="David"/>
-          <w:sz w:val="28"/>
-          <w:szCs w:val="28"/>
-        </w:rPr>
-        <w:t>המיוציטות</w:t>
-      </w:r>
-      <w:proofErr w:type="spellEnd"/>
-      <w:r>
-        <w:rPr>
-          <w:rFonts w:ascii="David" w:hAnsi="David" w:cs="David"/>
-          <w:sz w:val="28"/>
-          <w:szCs w:val="28"/>
-        </w:rPr>
-        <w:t xml:space="preserve"> </w:t>
-      </w:r>
-      <w:proofErr w:type="spellStart"/>
-      <w:r>
-        <w:rPr>
-          <w:rFonts w:ascii="David" w:hAnsi="David" w:cs="David"/>
-          <w:sz w:val="28"/>
-          <w:szCs w:val="28"/>
-        </w:rPr>
-        <w:t>איהה</w:t>
-      </w:r>
-      <w:proofErr w:type="spellEnd"/>
-      <w:r>
-        <w:rPr>
-          <w:rFonts w:ascii="David" w:hAnsi="David" w:cs="David"/>
-          <w:sz w:val="28"/>
-          <w:szCs w:val="28"/>
-        </w:rPr>
-        <w:t xml:space="preserve"> הולכה</w:t>
-      </w:r>
-    </w:p>
-    <w:p>
-      <w:pPr>
-        <w:rPr>
-          <w:rFonts w:ascii="David" w:hAnsi="David" w:cs="David"/>
-          <w:sz w:val="28"/>
-          <w:szCs w:val="28"/>
-        </w:rPr>
-      </w:pPr>
-      <w:r>
-        <w:rPr>
-          <w:rFonts w:ascii="David" w:hAnsi="David" w:cs="David"/>
-          <w:sz w:val="28"/>
-          <w:szCs w:val="28"/>
-        </w:rPr>
-        <w:t>• אשלגן מפריע לתפקוד זה</w:t>
-      </w:r>
-    </w:p>
-    <w:p>
-      <w:pPr>
-        <w:rPr>
-          <w:rFonts w:ascii="David" w:hAnsi="David" w:cs="David"/>
-          <w:sz w:val="28"/>
-          <w:szCs w:val="28"/>
-        </w:rPr>
-      </w:pPr>
-      <w:r>
-        <w:rPr>
-          <w:rFonts w:ascii="David" w:hAnsi="David" w:cs="David"/>
-          <w:sz w:val="28"/>
-          <w:szCs w:val="28"/>
-        </w:rPr>
-        <w:t xml:space="preserve">• לסידן יש השפעה מוכחת במניעת הפרעות קצב הנובעות </w:t>
-      </w:r>
-      <w:proofErr w:type="spellStart"/>
-      <w:r>
-        <w:rPr>
-          <w:rFonts w:ascii="David" w:hAnsi="David" w:cs="David"/>
-          <w:sz w:val="28"/>
-          <w:szCs w:val="28"/>
-        </w:rPr>
-        <w:t>מהיפרקלמיה</w:t>
-      </w:r>
-      <w:proofErr w:type="spellEnd"/>
-      <w:r>
-        <w:rPr>
-          <w:rFonts w:ascii="David" w:hAnsi="David" w:cs="David"/>
-          <w:sz w:val="28"/>
-          <w:szCs w:val="28"/>
-        </w:rPr>
-        <w:t xml:space="preserve"> (אנטגוניסט לאשלגן)</w:t>
-      </w:r>
-    </w:p>
-    <w:p>
-      <w:pPr>
-        <w:rPr>
-          <w:rFonts w:ascii="David" w:hAnsi="David" w:cs="David"/>
-          <w:sz w:val="28"/>
-          <w:szCs w:val="28"/>
-        </w:rPr>
-      </w:pPr>
-      <w:r>
-        <w:rPr>
-          <w:rFonts w:ascii="David" w:hAnsi="David" w:cs="David"/>
-          <w:sz w:val="28"/>
-          <w:szCs w:val="28"/>
-        </w:rPr>
-        <w:t>מנה: 1 גרם בהזלפה איטית (1-2 דקות)</w:t>
-      </w:r>
-    </w:p>
-    <w:p>
-      <w:pPr>
-        <w:rPr>
-          <w:rFonts w:ascii="David" w:hAnsi="David" w:cs="David"/>
-          <w:sz w:val="28"/>
-          <w:szCs w:val="28"/>
-        </w:rPr>
-      </w:pPr>
-      <w:r>
-        <w:rPr>
-          <w:rFonts w:ascii="David" w:hAnsi="David" w:cs="David"/>
-          <w:sz w:val="28"/>
-          <w:szCs w:val="28"/>
-        </w:rPr>
-        <w:t>• אמפולה מגיעה 1 גרם / 10 מ"ל</w:t>
-      </w:r>
-    </w:p>
-    <w:p>
-      <w:pPr>
-        <w:rPr>
-          <w:rFonts w:ascii="David" w:hAnsi="David" w:cs="David"/>
-          <w:sz w:val="28"/>
-          <w:szCs w:val="28"/>
-        </w:rPr>
-      </w:pPr>
-      <w:r>
-        <w:rPr>
-          <w:rFonts w:ascii="David" w:hAnsi="David" w:cs="David"/>
-          <w:sz w:val="28"/>
-          <w:szCs w:val="28"/>
-        </w:rPr>
-        <w:t>מטרת הטיפול</w:t>
-      </w:r>
-    </w:p>
-    <w:p>
-      <w:pPr>
-        <w:rPr>
-          <w:rFonts w:ascii="David" w:hAnsi="David" w:cs="David"/>
-          <w:sz w:val="28"/>
-          <w:szCs w:val="28"/>
-        </w:rPr>
-      </w:pPr>
-      <w:r>
-        <w:rPr>
-          <w:rFonts w:ascii="David" w:hAnsi="David" w:cs="David"/>
-          <w:sz w:val="28"/>
-          <w:szCs w:val="28"/>
-        </w:rPr>
-        <w:t xml:space="preserve">• התמודדות עם </w:t>
-      </w:r>
-      <w:proofErr w:type="spellStart"/>
-      <w:r>
-        <w:rPr>
-          <w:rFonts w:ascii="David" w:hAnsi="David" w:cs="David"/>
-          <w:sz w:val="28"/>
-          <w:szCs w:val="28"/>
-        </w:rPr>
-        <w:t>היפרקלמיה</w:t>
-      </w:r>
-      <w:proofErr w:type="spellEnd"/>
-    </w:p>
-    <w:p>
-      <w:pPr>
-        <w:rPr>
-          <w:rFonts w:ascii="David" w:hAnsi="David" w:cs="David"/>
-          <w:sz w:val="28"/>
-          <w:szCs w:val="28"/>
-        </w:rPr>
-      </w:pPr>
-      <w:r>
-        <w:rPr>
-          <w:rFonts w:ascii="David" w:hAnsi="David" w:cs="David"/>
-          <w:sz w:val="28"/>
-          <w:szCs w:val="28"/>
-        </w:rPr>
-        <w:t>• מסייע בהכנסת האשלגן מהדם אל התאים</w:t>
-      </w:r>
-    </w:p>
-    <w:p>
-      <w:pPr>
-        <w:rPr>
-          <w:rFonts w:ascii="David" w:hAnsi="David" w:cs="David"/>
-          <w:sz w:val="28"/>
-          <w:szCs w:val="28"/>
-        </w:rPr>
-      </w:pPr>
-      <w:r>
-        <w:rPr>
-          <w:rFonts w:ascii="David" w:hAnsi="David" w:cs="David"/>
-          <w:sz w:val="28"/>
-          <w:szCs w:val="28"/>
-        </w:rPr>
-        <w:t>• עוזר במניעת הפרעות קצב מסכנות חיים (מגן על שריר הלב)</w:t>
-      </w:r>
-    </w:p>
-    <w:p>
-      <w:pPr>
-        <w:rPr>
-          <w:rFonts w:ascii="David" w:hAnsi="David" w:cs="David"/>
-          <w:sz w:val="28"/>
-          <w:szCs w:val="28"/>
-        </w:rPr>
-      </w:pPr>
-    </w:p>
-    <w:p>
-      <w:pPr>
-        <w:rPr>
-          <w:rFonts w:ascii="David" w:hAnsi="David" w:cs="David"/>
-          <w:sz w:val="28"/>
-          <w:szCs w:val="28"/>
-        </w:rPr>
-      </w:pPr>
-    </w:p>
-    <w:p>
-      <w:pPr>
-        <w:rPr>
-          <w:rFonts w:ascii="David" w:hAnsi="David" w:cs="David"/>
-          <w:sz w:val="28"/>
-          <w:szCs w:val="28"/>
-        </w:rPr>
-      </w:pPr>
-      <w:r>
-        <w:rPr>
-          <w:rFonts w:ascii="David" w:hAnsi="David" w:cs="David" w:hint="cs"/>
-          <w:sz w:val="28"/>
-          <w:szCs w:val="28"/>
-        </w:rPr>
-        <w:t>טיפול תרופתי סודיום בי קרבונט</w:t>
-      </w:r>
-    </w:p>
-    <w:p>
-      <w:pPr>
-        <w:rPr>
-          <w:rFonts w:ascii="David" w:hAnsi="David" w:cs="David"/>
-          <w:sz w:val="28"/>
-          <w:szCs w:val="28"/>
-          <w:rtl w:val="0"/>
-        </w:rPr>
-      </w:pPr>
-      <w:r>
-        <w:rPr>
-          <w:rFonts w:ascii="David" w:hAnsi="David" w:cs="David"/>
-          <w:sz w:val="28"/>
-          <w:szCs w:val="28"/>
-        </w:rPr>
-        <w:t>הנה הטקסט עם רווחים בין המילים:</w:t>
-      </w:r>
-    </w:p>
-    <w:p>
-      <w:pPr>
-        <w:rPr>
-          <w:rFonts w:ascii="David" w:hAnsi="David" w:cs="David"/>
-          <w:sz w:val="28"/>
-          <w:szCs w:val="28"/>
-        </w:rPr>
-      </w:pPr>
-      <w:r>
-        <w:rPr>
-          <w:rFonts w:ascii="David" w:hAnsi="David" w:cs="David"/>
-          <w:sz w:val="28"/>
-          <w:szCs w:val="28"/>
-        </w:rPr>
-        <w:t xml:space="preserve">סודיום ביקרבונט - לפצועים עם עדות לפגיעה כלייתית או סימני </w:t>
-      </w:r>
-      <w:proofErr w:type="spellStart"/>
-      <w:r>
-        <w:rPr>
-          <w:rFonts w:ascii="David" w:hAnsi="David" w:cs="David"/>
-          <w:sz w:val="28"/>
-          <w:szCs w:val="28"/>
-        </w:rPr>
-        <w:t>היפרקלמיה</w:t>
-      </w:r>
-      <w:proofErr w:type="spellEnd"/>
-    </w:p>
-    <w:p>
-      <w:pPr>
-        <w:rPr>
-          <w:rFonts w:ascii="David" w:hAnsi="David" w:cs="David"/>
-          <w:sz w:val="28"/>
-          <w:szCs w:val="28"/>
-        </w:rPr>
-      </w:pPr>
-      <w:r>
-        <w:rPr>
-          <w:rFonts w:ascii="David" w:hAnsi="David" w:cs="David"/>
-          <w:sz w:val="28"/>
-          <w:szCs w:val="28"/>
-        </w:rPr>
-        <w:t>• מחייב ניטור רציף של המטופל</w:t>
-      </w:r>
-    </w:p>
-    <w:p>
-      <w:pPr>
-        <w:rPr>
-          <w:rFonts w:ascii="David" w:hAnsi="David" w:cs="David"/>
-          <w:sz w:val="28"/>
-          <w:szCs w:val="28"/>
-        </w:rPr>
-      </w:pPr>
-      <w:r>
-        <w:rPr>
-          <w:rFonts w:ascii="David" w:hAnsi="David" w:cs="David"/>
-          <w:sz w:val="28"/>
-          <w:szCs w:val="28"/>
-        </w:rPr>
-        <w:t>• נוגד חומצה מערכתי מהיר וחזק</w:t>
-      </w:r>
-    </w:p>
-    <w:p>
-      <w:pPr>
-        <w:rPr>
-          <w:rFonts w:ascii="David" w:hAnsi="David" w:cs="David"/>
-          <w:sz w:val="28"/>
-          <w:szCs w:val="28"/>
-        </w:rPr>
-      </w:pPr>
-      <w:r>
-        <w:rPr>
-          <w:rFonts w:ascii="David" w:hAnsi="David" w:cs="David"/>
-          <w:sz w:val="28"/>
-          <w:szCs w:val="28"/>
-        </w:rPr>
-        <w:t>מטרת הטיפול</w:t>
-      </w:r>
-    </w:p>
-    <w:p>
-      <w:pPr>
-        <w:rPr>
-          <w:rFonts w:ascii="David" w:hAnsi="David" w:cs="David"/>
-          <w:sz w:val="28"/>
-          <w:szCs w:val="28"/>
-        </w:rPr>
-      </w:pPr>
-      <w:r>
-        <w:rPr>
-          <w:rFonts w:ascii="David" w:hAnsi="David" w:cs="David"/>
-          <w:sz w:val="28"/>
-          <w:szCs w:val="28"/>
-        </w:rPr>
-        <w:t>• טיפול בחמצת המטבולית</w:t>
-      </w:r>
-    </w:p>
-    <w:p>
-      <w:pPr>
-        <w:rPr>
-          <w:rFonts w:ascii="David" w:hAnsi="David" w:cs="David"/>
-          <w:sz w:val="28"/>
-          <w:szCs w:val="28"/>
-        </w:rPr>
-      </w:pPr>
-      <w:r>
-        <w:rPr>
-          <w:rFonts w:ascii="David" w:hAnsi="David" w:cs="David"/>
-          <w:sz w:val="28"/>
-          <w:szCs w:val="28"/>
-        </w:rPr>
-        <w:t>• טיפול באי-ספיקת כליות</w:t>
-      </w:r>
-    </w:p>
-    <w:p>
-      <w:pPr>
-        <w:rPr>
-          <w:rFonts w:ascii="David" w:hAnsi="David" w:cs="David"/>
-          <w:sz w:val="28"/>
-          <w:szCs w:val="28"/>
-        </w:rPr>
-      </w:pPr>
-      <w:r>
-        <w:rPr>
-          <w:rFonts w:ascii="David" w:hAnsi="David" w:cs="David"/>
-          <w:sz w:val="28"/>
-          <w:szCs w:val="28"/>
-        </w:rPr>
-        <w:t xml:space="preserve">• טיפול </w:t>
-      </w:r>
-      <w:proofErr w:type="spellStart"/>
-      <w:r>
-        <w:rPr>
-          <w:rFonts w:ascii="David" w:hAnsi="David" w:cs="David"/>
-          <w:sz w:val="28"/>
-          <w:szCs w:val="28"/>
-        </w:rPr>
-        <w:t>בהיפרקלמיה</w:t>
-      </w:r>
-      <w:proofErr w:type="spellEnd"/>
-    </w:p>
-    <w:p>
-      <w:pPr>
-        <w:rPr>
-          <w:rFonts w:ascii="David" w:hAnsi="David" w:cs="David"/>
-          <w:sz w:val="28"/>
-          <w:szCs w:val="28"/>
-        </w:rPr>
-      </w:pPr>
-    </w:p>
-    <w:p>
-      <w:pPr>
-        <w:rPr>
-          <w:rFonts w:ascii="David" w:hAnsi="David" w:cs="David"/>
-          <w:sz w:val="28"/>
-          <w:szCs w:val="28"/>
-        </w:rPr>
-      </w:pPr>
-      <w:r>
-        <w:rPr>
-          <w:rFonts w:ascii="David" w:hAnsi="David" w:cs="David" w:hint="cs"/>
-          <w:sz w:val="28"/>
-          <w:szCs w:val="28"/>
-        </w:rPr>
-        <w:t xml:space="preserve">טיפול תרופתי </w:t>
-      </w:r>
-      <w:proofErr w:type="spellStart"/>
-      <w:r>
-        <w:rPr>
-          <w:rFonts w:ascii="David" w:hAnsi="David" w:cs="David" w:hint="cs"/>
-          <w:sz w:val="28"/>
-          <w:szCs w:val="28"/>
-        </w:rPr>
-        <w:t>פוסיד</w:t>
-      </w:r>
-      <w:proofErr w:type="spellEnd"/>
-    </w:p>
-    <w:p>
-      <w:pPr>
-        <w:rPr>
-          <w:rFonts w:ascii="David" w:hAnsi="David" w:cs="David" w:hint="cs"/>
+        <w:t>טיפול תרופתי פוסיד</w:t>
+      </w:r>
+    </w:p>
+    <w:p>
+      <w:pPr>
+        <w:rPr>
+          <w:rFonts w:ascii="David" w:hAnsi="David" w:cs="David"/>
           <w:sz w:val="28"/>
           <w:szCs w:val="28"/>
         </w:rPr>
@@ -7543,6 +6465,7 @@
   <w:style w:type="character" w:default="1" w:styleId="DefaultParagraphFont">
     <w:name w:val="Default Paragraph Font"/>
     <w:uiPriority w:val="1"/>
+    <w:semiHidden/>
     <w:unhideWhenUsed/>
   </w:style>
   <w:style w:type="table" w:default="1" w:styleId="TableNormal">

</xml_diff>